<commit_message>
Terminación de editorial: capitales, titulillos, folios, trilogía y portadas
Letra capital en cada apertura, titulillos alternados (libro en páginas
pares, capítulo con su emblema en impares), folios con ornamento, copyright
en Palatino, página «La trilogía» antes del índice, cuatro párrafos largos
divididos en pausas naturales, y tapa y contratapa de cada libro con los
grabados (los tres corazones del Cap. 1 en las tapas).

Co-Authored-By: Claude Opus 5.5 <noreply@anthropic.com>
Claude-Session: https://claude.ai/code/session_014ZXCqSPyLGg43e9ivReU3y
</commit_message>
<xml_diff>
--- a/manuscritos/El Pensamiento es Tu Fe (edición integral).docx
+++ b/manuscritos/El Pensamiento es Tu Fe (edición integral).docx
@@ -348,12 +348,22 @@
         </w:rPr>
       </w:pPr>
       <w:r>
+        <w:rPr>
+          <w:rFonts w:ascii="Palatino Linotype" w:hAnsi="Palatino Linotype" w:cs="Palatino Linotype"/>
+          <w:color w:val="4A4640"/>
+          <w:sz w:val="16"/>
+          <w:szCs w:val="16"/>
+        </w:rPr>
         <w:t xml:space="preserve">Copyright ©2026 por Julián Bermúdez y </w:t>
       </w:r>
       <w:r>
         <w:rPr>
+          <w:rFonts w:ascii="Palatino Linotype" w:hAnsi="Palatino Linotype" w:cs="Palatino Linotype"/>
           <w:i/>
           <w:iCs/>
+          <w:color w:val="4A4640"/>
+          <w:sz w:val="16"/>
+          <w:szCs w:val="16"/>
         </w:rPr>
         <w:t xml:space="preserve">ELVERBO EDITORIAL </w:t>
       </w:r>
@@ -365,6 +375,12 @@
         <w:jc w:val="both"/>
       </w:pPr>
       <w:r>
+        <w:rPr>
+          <w:rFonts w:ascii="Palatino Linotype" w:hAnsi="Palatino Linotype" w:cs="Palatino Linotype"/>
+          <w:color w:val="4A4640"/>
+          <w:sz w:val="16"/>
+          <w:szCs w:val="16"/>
+        </w:rPr>
         <w:t>El Pensamiento es Tu Fe</w:t>
       </w:r>
     </w:p>
@@ -373,6 +389,12 @@
         <w:jc w:val="both"/>
       </w:pPr>
       <w:r>
+        <w:rPr>
+          <w:rFonts w:ascii="Palatino Linotype" w:hAnsi="Palatino Linotype" w:cs="Palatino Linotype"/>
+          <w:color w:val="4A4640"/>
+          <w:sz w:val="16"/>
+          <w:szCs w:val="16"/>
+        </w:rPr>
         <w:t> </w:t>
       </w:r>
     </w:p>
@@ -382,6 +404,12 @@
         <w:jc w:val="both"/>
       </w:pPr>
       <w:r>
+        <w:rPr>
+          <w:rFonts w:ascii="Palatino Linotype" w:hAnsi="Palatino Linotype" w:cs="Palatino Linotype"/>
+          <w:color w:val="4A4640"/>
+          <w:sz w:val="16"/>
+          <w:szCs w:val="16"/>
+        </w:rPr>
         <w:t xml:space="preserve">Todos los derechos reservados. </w:t>
       </w:r>
     </w:p>
@@ -391,6 +419,12 @@
         <w:jc w:val="both"/>
       </w:pPr>
       <w:r>
+        <w:rPr>
+          <w:rFonts w:ascii="Palatino Linotype" w:hAnsi="Palatino Linotype" w:cs="Palatino Linotype"/>
+          <w:color w:val="4A4640"/>
+          <w:sz w:val="16"/>
+          <w:szCs w:val="16"/>
+        </w:rPr>
         <w:t>Queda prohibida la reproducción total o parcial de esta publicación, así como su almacenamiento en un sistema de recuperación de información o su transmisión en cualquier forma o por cualquier medio —electrónico, mecánico, fotocopia, grabación o cualquier otro— sin la autorización previa y por escrito del editor, excepto en el caso de citas breves utilizadas en reseñas críticas o referencias bibliográficas. </w:t>
       </w:r>
     </w:p>
@@ -399,6 +433,12 @@
         <w:jc w:val="both"/>
       </w:pPr>
       <w:r>
+        <w:rPr>
+          <w:rFonts w:ascii="Palatino Linotype" w:hAnsi="Palatino Linotype" w:cs="Palatino Linotype"/>
+          <w:color w:val="4A4640"/>
+          <w:sz w:val="16"/>
+          <w:szCs w:val="16"/>
+        </w:rPr>
         <w:t> </w:t>
       </w:r>
     </w:p>
@@ -408,6 +448,12 @@
         <w:jc w:val="both"/>
       </w:pPr>
       <w:r>
+        <w:rPr>
+          <w:rFonts w:ascii="Palatino Linotype" w:hAnsi="Palatino Linotype" w:cs="Palatino Linotype"/>
+          <w:color w:val="4A4640"/>
+          <w:sz w:val="16"/>
+          <w:szCs w:val="16"/>
+        </w:rPr>
         <w:t>ISBN-13: 3333333333333 </w:t>
       </w:r>
     </w:p>
@@ -417,6 +463,12 @@
         <w:jc w:val="both"/>
       </w:pPr>
       <w:r>
+        <w:rPr>
+          <w:rFonts w:ascii="Palatino Linotype" w:hAnsi="Palatino Linotype" w:cs="Palatino Linotype"/>
+          <w:color w:val="4A4640"/>
+          <w:sz w:val="16"/>
+          <w:szCs w:val="16"/>
+        </w:rPr>
         <w:t>ISBN-10: 3333333333</w:t>
       </w:r>
     </w:p>
@@ -425,6 +477,12 @@
         <w:jc w:val="both"/>
       </w:pPr>
       <w:r>
+        <w:rPr>
+          <w:rFonts w:ascii="Palatino Linotype" w:hAnsi="Palatino Linotype" w:cs="Palatino Linotype"/>
+          <w:color w:val="4A4640"/>
+          <w:sz w:val="16"/>
+          <w:szCs w:val="16"/>
+        </w:rPr>
         <w:t> </w:t>
       </w:r>
     </w:p>
@@ -439,8 +497,12 @@
       </w:pPr>
       <w:r>
         <w:rPr>
+          <w:rFonts w:ascii="Palatino Linotype" w:hAnsi="Palatino Linotype" w:cs="Palatino Linotype"/>
           <w:i/>
           <w:iCs/>
+          <w:color w:val="4A4640"/>
+          <w:sz w:val="16"/>
+          <w:szCs w:val="16"/>
         </w:rPr>
         <w:t>Editado por Lucas Ezequiel Avonto</w:t>
       </w:r>
@@ -452,8 +514,12 @@
       </w:pPr>
       <w:r>
         <w:rPr>
+          <w:rFonts w:ascii="Palatino Linotype" w:hAnsi="Palatino Linotype" w:cs="Palatino Linotype"/>
           <w:i/>
           <w:iCs/>
+          <w:color w:val="4A4640"/>
+          <w:sz w:val="16"/>
+          <w:szCs w:val="16"/>
         </w:rPr>
         <w:t xml:space="preserve">ELVERBO EDITORIAL</w:t>
       </w:r>
@@ -469,8 +535,12 @@
       </w:pPr>
       <w:r>
         <w:rPr>
+          <w:rFonts w:ascii="Palatino Linotype" w:hAnsi="Palatino Linotype" w:cs="Palatino Linotype"/>
           <w:i/>
           <w:iCs/>
+          <w:color w:val="4A4640"/>
+          <w:sz w:val="16"/>
+          <w:szCs w:val="16"/>
         </w:rPr>
         <w:t xml:space="preserve">Diseño de portada © ELVERBO, 2026 </w:t>
       </w:r>
@@ -485,7 +555,163 @@
         <w:jc w:val="center"/>
       </w:pPr>
       <w:r>
+        <w:rPr>
+          <w:rFonts w:ascii="Palatino Linotype" w:hAnsi="Palatino Linotype" w:cs="Palatino Linotype"/>
+          <w:color w:val="4A4640"/>
+          <w:sz w:val="16"/>
+          <w:szCs w:val="16"/>
+        </w:rPr>
         <w:t>Impreso en Buenos Aires, Argentina</w:t>
+      </w:r>
+    </w:p>
+    <w:p>
+      <w:pPr>
+        <w:keepNext/>
+        <w:pageBreakBefore/>
+        <w:spacing w:before="2300" w:after="120"/>
+        <w:jc w:val="center"/>
+      </w:pPr>
+      <w:r>
+        <w:rPr>
+          <w:rFonts w:ascii="Palatino Linotype" w:hAnsi="Palatino Linotype" w:cs="Palatino Linotype"/>
+          <w:color w:val="6E6A63"/>
+          <w:spacing w:val="160"/>
+          <w:sz w:val="22"/>
+          <w:szCs w:val="22"/>
+          <w:lang w:val="es-AR"/>
+        </w:rPr>
+        <w:t xml:space="preserve">LA TRILOGÍA</w:t>
+      </w:r>
+    </w:p>
+    <w:p>
+      <w:pPr>
+        <w:keepNext/>
+        <w:spacing w:before="0" w:after="560"/>
+        <w:jc w:val="center"/>
+      </w:pPr>
+      <w:r>
+        <w:rPr>
+          <w:rFonts w:ascii="Palatino Linotype" w:hAnsi="Palatino Linotype" w:cs="Palatino Linotype"/>
+          <w:color w:val="6E6A63"/>
+          <w:sz w:val="16"/>
+          <w:szCs w:val="16"/>
+          <w:lang w:val="es-AR"/>
+        </w:rPr>
+        <w:t xml:space="preserve">◆</w:t>
+      </w:r>
+    </w:p>
+    <w:p>
+      <w:pPr>
+        <w:keepNext/>
+        <w:spacing w:before="0" w:after="40"/>
+        <w:jc w:val="center"/>
+      </w:pPr>
+      <w:r>
+        <w:rPr>
+          <w:rFonts w:ascii="Palatino Linotype" w:hAnsi="Palatino Linotype" w:cs="Palatino Linotype"/>
+          <w:color w:val="6E6A63"/>
+          <w:spacing w:val="70"/>
+          <w:sz w:val="18"/>
+          <w:szCs w:val="18"/>
+          <w:lang w:val="es-AR"/>
+        </w:rPr>
+        <w:t xml:space="preserve">I  ·  LA RECETA DE LA MANIFESTACIÓN</w:t>
+      </w:r>
+    </w:p>
+    <w:p>
+      <w:pPr>
+        <w:keepNext/>
+        <w:spacing w:before="0" w:after="380"/>
+        <w:jc w:val="center"/>
+      </w:pPr>
+      <w:r>
+        <w:rPr>
+          <w:rFonts w:ascii="Palatino Linotype" w:hAnsi="Palatino Linotype" w:cs="Palatino Linotype"/>
+          <w:i/>
+          <w:iCs/>
+          <w:color w:val="6E6A63"/>
+          <w:spacing w:val="20"/>
+          <w:sz w:val="17"/>
+          <w:szCs w:val="17"/>
+          <w:lang w:val="es-AR"/>
+        </w:rPr>
+        <w:t xml:space="preserve">el cómo</w:t>
+      </w:r>
+    </w:p>
+    <w:p>
+      <w:pPr>
+        <w:keepNext/>
+        <w:spacing w:before="0" w:after="40"/>
+        <w:jc w:val="center"/>
+      </w:pPr>
+      <w:r>
+        <w:rPr>
+          <w:rFonts w:ascii="Palatino Linotype" w:hAnsi="Palatino Linotype" w:cs="Palatino Linotype"/>
+          <w:color w:val="2B2B2B"/>
+          <w:spacing w:val="70"/>
+          <w:sz w:val="20"/>
+          <w:szCs w:val="20"/>
+          <w:lang w:val="es-AR"/>
+        </w:rPr>
+        <w:t xml:space="preserve">II  ·  EL PENSAMIENTO ES TU FE</w:t>
+      </w:r>
+    </w:p>
+    <w:p>
+      <w:pPr>
+        <w:keepNext/>
+        <w:spacing w:before="0" w:after="380"/>
+        <w:jc w:val="center"/>
+      </w:pPr>
+      <w:r>
+        <w:rPr>
+          <w:rFonts w:ascii="Palatino Linotype" w:hAnsi="Palatino Linotype" w:cs="Palatino Linotype"/>
+          <w:i/>
+          <w:iCs/>
+          <w:color w:val="6E6A63"/>
+          <w:spacing w:val="20"/>
+          <w:sz w:val="17"/>
+          <w:szCs w:val="17"/>
+          <w:lang w:val="es-AR"/>
+        </w:rPr>
+        <w:t xml:space="preserve">el porqué</w:t>
+      </w:r>
+    </w:p>
+    <w:p>
+      <w:pPr>
+        <w:keepNext/>
+        <w:spacing w:before="0" w:after="40"/>
+        <w:jc w:val="center"/>
+      </w:pPr>
+      <w:r>
+        <w:rPr>
+          <w:rFonts w:ascii="Palatino Linotype" w:hAnsi="Palatino Linotype" w:cs="Palatino Linotype"/>
+          <w:color w:val="6E6A63"/>
+          <w:spacing w:val="70"/>
+          <w:sz w:val="18"/>
+          <w:szCs w:val="18"/>
+          <w:lang w:val="es-AR"/>
+        </w:rPr>
+        <w:t xml:space="preserve">III  ·  LA BIOGRAFÍA</w:t>
+      </w:r>
+    </w:p>
+    <w:p>
+      <w:pPr>
+        <w:keepNext/>
+        <w:spacing w:before="0" w:after="380"/>
+        <w:jc w:val="center"/>
+      </w:pPr>
+      <w:r>
+        <w:rPr>
+          <w:rFonts w:ascii="Palatino Linotype" w:hAnsi="Palatino Linotype" w:cs="Palatino Linotype"/>
+          <w:i/>
+          <w:iCs/>
+          <w:color w:val="6E6A63"/>
+          <w:spacing w:val="20"/>
+          <w:sz w:val="17"/>
+          <w:szCs w:val="17"/>
+          <w:lang w:val="es-AR"/>
+        </w:rPr>
+        <w:t xml:space="preserve">el quién</w:t>
       </w:r>
     </w:p>
     <w:p>
@@ -1113,7 +1339,26 @@
     </w:p>
     <w:p>
       <w:pPr>
+        <w:keepNext/>
         <w:pageBreakBefore/>
+        <w:framePr w:dropCap="drop" w:lines="3" w:wrap="around" w:vAnchor="text" w:hAnchor="text"/>
+        <w:spacing w:before="0" w:after="0" w:line="880" w:lineRule="exact"/>
+        <w:textAlignment w:val="baseline"/>
+      </w:pPr>
+      <w:r>
+        <w:rPr>
+          <w:rFonts w:ascii="Palatino Linotype" w:hAnsi="Palatino Linotype" w:cs="Palatino Linotype"/>
+          <w:color w:val="2B2B2B"/>
+          <w:position w:val="-9"/>
+          <w:sz w:val="108"/>
+          <w:szCs w:val="108"/>
+          <w:lang w:val="es-AR"/>
+        </w:rPr>
+        <w:t xml:space="preserve">E</w:t>
+      </w:r>
+    </w:p>
+    <w:p>
+      <w:pPr>
         <w:spacing w:before="0" w:after="150" w:line="290" w:lineRule="auto"/>
         <w:jc w:val="both"/>
         <w:rPr>
@@ -1126,7 +1371,7 @@
           <w:smallCaps/>
           <w:spacing w:val="30"/>
         </w:rPr>
-        <w:t xml:space="preserve">En el principio</w:t>
+        <w:t xml:space="preserve">n el principio</w:t>
       </w:r>
       <w:r>
         <w:rPr>
@@ -1400,8 +1645,24 @@
         <w:rPr>
           <w:rFonts w:ascii="Palatino Linotype" w:hAnsi="Palatino Linotype" w:cs="Times New Roman"/>
         </w:rPr>
-        <w:t xml:space="preserve">Entonces, fijate que es muy importante entender esto. Una pluma, una pluma para escribir, te da la necesidad de otro elemento que tenga la tinta portátil —fijate que no se llama lápiz, en ese momento se llama «un elemento que tenga la tinta portátil»—: pasar de una pluma a este tipo de pluma. Es la misma pluma, pero tecnológicamente avanzada. Entonces, en ese momento se crea una necesidad, con un sentimiento de vacío, porque vos tenés una pluma, no tenés una lapicera. Tenés una pluma, y te gustaría llegar a la lapicera, entonces hay un vacío. De tantas formas lógicas y abiertas —porque esto es importante también—, uno se pone a imaginar de muchas formas la pluma hecha de otra forma. Tal vez una pluma ave, con un cartucho, con una lanza, hay un montón de inventos que pudieron haber llegado, obviamente, antes de una lapicera. No </w:t>
+        <w:t xml:space="preserve">Entonces, fijate que es muy importante entender esto. Una pluma, una pluma para escribir, te da la necesidad de otro elemento que tenga la tinta portátil —fijate que no se llama lápiz, en ese momento se llama «un elemento que tenga la tinta portátil»—: pasar de una pluma a este tipo de pluma. Es la misma pluma, pero tecnológicamente avanzada. Entonces, en ese momento se crea una necesidad, con un sentimiento de vacío, porque vos tenés una pluma, no tenés una lapicera. Tenés una pluma, y te gustaría llegar a la lapicera, entonces hay un vacío. </w:t>
         <w:lastRenderedPageBreak/>
+        <w:t xml:space="preserve"/>
+      </w:r>
+    </w:p>
+    <w:p>
+      <w:pPr>
+        <w:spacing w:before="0" w:after="150" w:line="290" w:lineRule="auto"/>
+        <w:jc w:val="both"/>
+        <w:rPr>
+          <w:rFonts w:ascii="Palatino Linotype" w:hAnsi="Palatino Linotype" w:cs="Times New Roman"/>
+        </w:rPr>
+      </w:pPr>
+      <w:r>
+        <w:rPr>
+          <w:rFonts w:ascii="Palatino Linotype" w:hAnsi="Palatino Linotype" w:cs="Times New Roman"/>
+        </w:rPr>
+        <w:t xml:space="preserve">De tantas formas lógicas y abiertas —porque esto es importante también—, uno se pone a imaginar de muchas formas la pluma hecha de otra forma. Tal vez una pluma ave, con un cartucho, con una lanza, hay un montón de inventos que pudieron haber llegado, obviamente, antes de una lapicera. No </w:t>
         <w:t xml:space="preserve">se sale de la pluma a la lapicera, a la birome, digamos. De hecho, lo que hicieron Biro y Meyne: hicieron justamente la birome, que tardaron como tres o seis meses en poner la pelotita adentro, en la birome, adentro de la boca, para que tinte. Entonces, para llegar a eso, se necesita muchísimo imaginar otras cosas.</w:t>
       </w:r>
     </w:p>
@@ -1456,8 +1717,10 @@
         <w:spacing w:before="420" w:after="0"/>
         <w:jc w:val="center"/>
         <w:sectPr>
-          <w:headerReference w:type="default" r:id="rIdJB2"/>
-          <w:footerReference w:type="default" r:id="rId938"/>
+          <w:headerReference w:type="default" r:id="rIdJB26"/>
+          <w:headerReference w:type="even" r:id="rIdJB27"/>
+          <w:footerReference w:type="default" r:id="rIdJB40"/>
+          <w:footerReference w:type="even" r:id="rIdJB40"/>
           <w:type w:val="continuous"/>
           <w:pgSz w:w="7920" w:h="12240"/>
           <w:pgMar w:top="1080" w:right="792" w:bottom="1008" w:left="1080" w:header="560" w:footer="500" w:gutter="0"/>
@@ -1607,18 +1870,37 @@
     </w:p>
     <w:p>
       <w:pPr>
+        <w:keepNext/>
         <w:pageBreakBefore/>
-        <w:spacing w:before="0" w:after="150" w:line="290" w:lineRule="auto"/>
-        <w:jc w:val="both"/>
-        <w:rPr>
-          <w:rFonts w:ascii="Palatino Linotype" w:hAnsi="Palatino Linotype" w:cs="Times New Roman"/>
-        </w:rPr>
-      </w:pPr>
-      <w:r>
-        <w:rPr>
-          <w:rFonts w:ascii="Palatino Linotype" w:hAnsi="Palatino Linotype" w:cs="Times New Roman"/>
-        </w:rPr>
-        <w:t xml:space="preserve">Mis experiencias son todas en realidad proyecciones externas de una libertad interna que tengo yo de hablar en base a que tengo determinadas cosas y sentir que esas conversaciones son muy reales. </w:t>
+        <w:framePr w:dropCap="drop" w:lines="3" w:wrap="around" w:vAnchor="text" w:hAnchor="text"/>
+        <w:spacing w:before="0" w:after="0" w:line="880" w:lineRule="exact"/>
+        <w:textAlignment w:val="baseline"/>
+      </w:pPr>
+      <w:r>
+        <w:rPr>
+          <w:rFonts w:ascii="Palatino Linotype" w:hAnsi="Palatino Linotype" w:cs="Palatino Linotype"/>
+          <w:color w:val="2B2B2B"/>
+          <w:position w:val="-9"/>
+          <w:sz w:val="108"/>
+          <w:szCs w:val="108"/>
+          <w:lang w:val="es-AR"/>
+        </w:rPr>
+        <w:t xml:space="preserve">M</w:t>
+      </w:r>
+    </w:p>
+    <w:p>
+      <w:pPr>
+        <w:spacing w:before="0" w:after="150" w:line="290" w:lineRule="auto"/>
+        <w:jc w:val="both"/>
+        <w:rPr>
+          <w:rFonts w:ascii="Palatino Linotype" w:hAnsi="Palatino Linotype" w:cs="Times New Roman"/>
+        </w:rPr>
+      </w:pPr>
+      <w:r>
+        <w:rPr>
+          <w:rFonts w:ascii="Palatino Linotype" w:hAnsi="Palatino Linotype" w:cs="Times New Roman"/>
+        </w:rPr>
+        <w:t xml:space="preserve">is experiencias son todas en realidad proyecciones externas de una libertad interna que tengo yo de hablar en base a que tengo determinadas cosas y sentir que esas conversaciones son muy reales. </w:t>
       </w:r>
     </w:p>
     <w:p>
@@ -1915,8 +2197,10 @@
         <w:spacing w:before="420" w:after="0"/>
         <w:jc w:val="center"/>
         <w:sectPr>
-          <w:headerReference w:type="default" r:id="rIdJB4"/>
-          <w:footerReference w:type="default" r:id="rId938"/>
+          <w:headerReference w:type="default" r:id="rIdJB28"/>
+          <w:headerReference w:type="even" r:id="rIdJB29"/>
+          <w:footerReference w:type="default" r:id="rIdJB40"/>
+          <w:footerReference w:type="even" r:id="rIdJB40"/>
           <w:type w:val="continuous"/>
           <w:pgSz w:w="7920" w:h="12240"/>
           <w:pgMar w:top="1080" w:right="792" w:bottom="1008" w:left="1080" w:header="560" w:footer="500" w:gutter="0"/>
@@ -2083,7 +2367,26 @@
     </w:p>
     <w:p>
       <w:pPr>
+        <w:keepNext/>
         <w:pageBreakBefore/>
+        <w:framePr w:dropCap="drop" w:lines="3" w:wrap="around" w:vAnchor="text" w:hAnchor="text"/>
+        <w:spacing w:before="0" w:after="0" w:line="880" w:lineRule="exact"/>
+        <w:textAlignment w:val="baseline"/>
+      </w:pPr>
+      <w:r>
+        <w:rPr>
+          <w:rFonts w:ascii="Palatino Linotype" w:hAnsi="Palatino Linotype" w:cs="Palatino Linotype"/>
+          <w:color w:val="2B2B2B"/>
+          <w:position w:val="-9"/>
+          <w:sz w:val="108"/>
+          <w:szCs w:val="108"/>
+          <w:lang w:val="es-AR"/>
+        </w:rPr>
+        <w:t xml:space="preserve">N</w:t>
+      </w:r>
+    </w:p>
+    <w:p>
+      <w:pPr>
         <w:spacing w:before="0" w:after="150" w:line="290" w:lineRule="auto"/>
         <w:jc w:val="both"/>
         <w:rPr>
@@ -2096,7 +2399,7 @@
         <w:rPr>
           <w:rFonts w:ascii="Palatino Linotype" w:eastAsia="Times New Roman" w:hAnsi="Palatino Linotype" w:cs="Times New Roman"/>
         </w:rPr>
-        <w:t xml:space="preserve">No se puede forzar este saber que soy consciente de tener mucho dinero, este saber que soy consciente de tener pareja, este saber que soy consciente de tener muchísima suerte y muchísimos elementos y cosas.</w:t>
+        <w:t xml:space="preserve">o se puede forzar este saber que soy consciente de tener mucho dinero, este saber que soy consciente de tener pareja, este saber que soy consciente de tener muchísima suerte y muchísimos elementos y cosas.</w:t>
       </w:r>
       <w:r>
         <w:rPr>
@@ -2338,7 +2641,10 @@
         <w:spacing w:before="420" w:after="0"/>
         <w:jc w:val="center"/>
         <w:sectPr>
-          <w:headerReference w:type="default" r:id="rIdJB6"/>
+          <w:headerReference w:type="default" r:id="rIdJB30"/>
+          <w:headerReference w:type="even" r:id="rIdJB31"/>
+          <w:footerReference w:type="default" r:id="rIdJB40"/>
+          <w:footerReference w:type="even" r:id="rIdJB40"/>
           <w:type w:val="continuous"/>
           <w:pgSz w:w="7920" w:h="12240"/>
           <w:pgMar w:top="1080" w:right="792" w:bottom="1008" w:left="1080" w:header="560" w:footer="500" w:gutter="0"/>
@@ -2504,18 +2810,37 @@
     </w:p>
     <w:p>
       <w:pPr>
+        <w:keepNext/>
         <w:pageBreakBefore/>
-        <w:spacing w:before="0" w:after="150" w:line="290" w:lineRule="auto"/>
-        <w:jc w:val="both"/>
-        <w:rPr>
-          <w:rFonts w:ascii="Palatino Linotype" w:hAnsi="Palatino Linotype" w:cs="Times New Roman"/>
-        </w:rPr>
-      </w:pPr>
-      <w:r>
-        <w:rPr>
-          <w:rFonts w:ascii="Palatino Linotype" w:hAnsi="Palatino Linotype" w:cs="Times New Roman"/>
-        </w:rPr>
-        <w:t xml:space="preserve">Yo creo que ahora que estoy concentrado en contarte todas estas cosas del pasado, verdaderamente lo que siento es que en realidad se materializó mi conversación de actuar el pasado. Yo, en el pasado... el pasado era un presente para mí, era como esto hoy y ahora. Solo que me acuerdo precisamente que logré hablar de mis condiciones.</w:t>
+        <w:framePr w:dropCap="drop" w:lines="3" w:wrap="around" w:vAnchor="text" w:hAnchor="text"/>
+        <w:spacing w:before="0" w:after="0" w:line="880" w:lineRule="exact"/>
+        <w:textAlignment w:val="baseline"/>
+      </w:pPr>
+      <w:r>
+        <w:rPr>
+          <w:rFonts w:ascii="Palatino Linotype" w:hAnsi="Palatino Linotype" w:cs="Palatino Linotype"/>
+          <w:color w:val="2B2B2B"/>
+          <w:position w:val="-9"/>
+          <w:sz w:val="108"/>
+          <w:szCs w:val="108"/>
+          <w:lang w:val="es-AR"/>
+        </w:rPr>
+        <w:t xml:space="preserve">Y</w:t>
+      </w:r>
+    </w:p>
+    <w:p>
+      <w:pPr>
+        <w:spacing w:before="0" w:after="150" w:line="290" w:lineRule="auto"/>
+        <w:jc w:val="both"/>
+        <w:rPr>
+          <w:rFonts w:ascii="Palatino Linotype" w:hAnsi="Palatino Linotype" w:cs="Times New Roman"/>
+        </w:rPr>
+      </w:pPr>
+      <w:r>
+        <w:rPr>
+          <w:rFonts w:ascii="Palatino Linotype" w:hAnsi="Palatino Linotype" w:cs="Times New Roman"/>
+        </w:rPr>
+        <w:t xml:space="preserve">o creo que ahora que estoy concentrado en contarte todas estas cosas del pasado, verdaderamente lo que siento es que en realidad se materializó mi conversación de actuar el pasado. Yo, en el pasado... el pasado era un presente para mí, era como esto hoy y ahora. Solo que me acuerdo precisamente que logré hablar de mis condiciones.</w:t>
       </w:r>
     </w:p>
     <w:p>
@@ -2678,8 +3003,10 @@
         <w:spacing w:before="420" w:after="0"/>
         <w:jc w:val="center"/>
         <w:sectPr>
-          <w:headerReference w:type="default" r:id="rIdJB8"/>
-          <w:footerReference w:type="default" r:id="rId938"/>
+          <w:headerReference w:type="default" r:id="rIdJB32"/>
+          <w:headerReference w:type="even" r:id="rIdJB33"/>
+          <w:footerReference w:type="default" r:id="rIdJB40"/>
+          <w:footerReference w:type="even" r:id="rIdJB40"/>
           <w:type w:val="continuous"/>
           <w:pgSz w:w="7920" w:h="12240"/>
           <w:pgMar w:top="1080" w:right="792" w:bottom="1008" w:left="1080" w:header="560" w:footer="500" w:gutter="0"/>
@@ -2845,7 +3172,26 @@
     </w:p>
     <w:p>
       <w:pPr>
+        <w:keepNext/>
         <w:pageBreakBefore/>
+        <w:framePr w:dropCap="drop" w:lines="3" w:wrap="around" w:vAnchor="text" w:hAnchor="text"/>
+        <w:spacing w:before="0" w:after="0" w:line="880" w:lineRule="exact"/>
+        <w:textAlignment w:val="baseline"/>
+      </w:pPr>
+      <w:r>
+        <w:rPr>
+          <w:rFonts w:ascii="Palatino Linotype" w:hAnsi="Palatino Linotype" w:cs="Palatino Linotype"/>
+          <w:color w:val="2B2B2B"/>
+          <w:position w:val="-9"/>
+          <w:sz w:val="108"/>
+          <w:szCs w:val="108"/>
+          <w:lang w:val="es-AR"/>
+        </w:rPr>
+        <w:t xml:space="preserve">L</w:t>
+      </w:r>
+    </w:p>
+    <w:p>
+      <w:pPr>
         <w:spacing w:before="0" w:after="150" w:line="290" w:lineRule="auto"/>
         <w:jc w:val="both"/>
         <w:rPr>
@@ -2857,7 +3203,7 @@
           <w:rFonts w:ascii="Palatino Linotype" w:hAnsi="Palatino Linotype" w:cs="Times New Roman"/>
         </w:rPr>
         <w:lastRenderedPageBreak/>
-        <w:t xml:space="preserve">La inteligencia natural y la inteligencia artificial: uno tiene que entender cosas básicas y dejar de darle vueltas. ¿La inteligencia artificial fue creada por la inteligencia natural, o la inteligencia natural fue creada por la artificial? Las teorías conspirativas de esto y lo otro te van a decir un montón de cosas que no nos interesan, como por ejemplo que nosotros fuimos creados por máquinas. Pero eso no es así. Entonces, tampoco me voy a poner a discutir por qué es así, porque retrocederían años en mi realidad.</w:t>
+        <w:t xml:space="preserve">a inteligencia natural y la inteligencia artificial: uno tiene que entender cosas básicas y dejar de darle vueltas. ¿La inteligencia artificial fue creada por la inteligencia natural, o la inteligencia natural fue creada por la artificial? Las teorías conspirativas de esto y lo otro te van a decir un montón de cosas que no nos interesan, como por ejemplo que nosotros fuimos creados por máquinas. Pero eso no es así. Entonces, tampoco me voy a poner a discutir por qué es así, porque retrocederían años en mi realidad.</w:t>
       </w:r>
     </w:p>
     <w:p>
@@ -2959,8 +3305,10 @@
         <w:spacing w:before="420" w:after="0"/>
         <w:jc w:val="center"/>
         <w:sectPr>
-          <w:headerReference w:type="default" r:id="rIdJB10"/>
-          <w:footerReference w:type="default" r:id="rId938"/>
+          <w:headerReference w:type="default" r:id="rIdJB34"/>
+          <w:headerReference w:type="even" r:id="rIdJB35"/>
+          <w:footerReference w:type="default" r:id="rIdJB40"/>
+          <w:footerReference w:type="even" r:id="rIdJB40"/>
           <w:type w:val="continuous"/>
           <w:pgSz w:w="7920" w:h="12240"/>
           <w:pgMar w:top="1080" w:right="792" w:bottom="1008" w:left="1080" w:header="560" w:footer="500" w:gutter="0"/>
@@ -3126,18 +3474,37 @@
     </w:p>
     <w:p>
       <w:pPr>
+        <w:keepNext/>
         <w:pageBreakBefore/>
-        <w:spacing w:before="0" w:after="150" w:line="290" w:lineRule="auto"/>
-        <w:jc w:val="both"/>
-        <w:rPr>
-          <w:rFonts w:ascii="Palatino Linotype" w:hAnsi="Palatino Linotype" w:cs="Times New Roman"/>
-        </w:rPr>
-      </w:pPr>
-      <w:r>
-        <w:rPr>
-          <w:rFonts w:ascii="Palatino Linotype" w:hAnsi="Palatino Linotype" w:cs="Times New Roman"/>
-        </w:rPr>
-        <w:t xml:space="preserve">No la personalidad de brujo, de brujito. El brujito que va por ahí en la vida, que ya lo conocemos, porque hoy con el tema de las redes se da a conocer esto. Hay un montón de avatares vestidos de brujos que, no sé, son brujitos y hacen que, por prender un sahumerio, tienen poder, y esas cosas. Y está buenísimo, pero eso es un arquetipo que no tiene su fuerza como tal, por más que creas que las energías y que prender un sahumerio y esto y lo otro.</w:t>
+        <w:framePr w:dropCap="drop" w:lines="3" w:wrap="around" w:vAnchor="text" w:hAnchor="text"/>
+        <w:spacing w:before="0" w:after="0" w:line="880" w:lineRule="exact"/>
+        <w:textAlignment w:val="baseline"/>
+      </w:pPr>
+      <w:r>
+        <w:rPr>
+          <w:rFonts w:ascii="Palatino Linotype" w:hAnsi="Palatino Linotype" w:cs="Palatino Linotype"/>
+          <w:color w:val="2B2B2B"/>
+          <w:position w:val="-9"/>
+          <w:sz w:val="108"/>
+          <w:szCs w:val="108"/>
+          <w:lang w:val="es-AR"/>
+        </w:rPr>
+        <w:t xml:space="preserve">N</w:t>
+      </w:r>
+    </w:p>
+    <w:p>
+      <w:pPr>
+        <w:spacing w:before="0" w:after="150" w:line="290" w:lineRule="auto"/>
+        <w:jc w:val="both"/>
+        <w:rPr>
+          <w:rFonts w:ascii="Palatino Linotype" w:hAnsi="Palatino Linotype" w:cs="Times New Roman"/>
+        </w:rPr>
+      </w:pPr>
+      <w:r>
+        <w:rPr>
+          <w:rFonts w:ascii="Palatino Linotype" w:hAnsi="Palatino Linotype" w:cs="Times New Roman"/>
+        </w:rPr>
+        <w:t xml:space="preserve">o la personalidad de brujo, de brujito. El brujito que va por ahí en la vida, que ya lo conocemos, porque hoy con el tema de las redes se da a conocer esto. Hay un montón de avatares vestidos de brujos que, no sé, son brujitos y hacen que, por prender un sahumerio, tienen poder, y esas cosas. Y está buenísimo, pero eso es un arquetipo que no tiene su fuerza como tal, por más que creas que las energías y que prender un sahumerio y esto y lo otro.</w:t>
       </w:r>
     </w:p>
     <w:p>
@@ -3318,8 +3685,10 @@
         <w:spacing w:before="420" w:after="0"/>
         <w:jc w:val="center"/>
         <w:sectPr>
-          <w:headerReference w:type="default" r:id="rIdJB12"/>
-          <w:footerReference w:type="default" r:id="rId938"/>
+          <w:headerReference w:type="default" r:id="rIdJB36"/>
+          <w:headerReference w:type="even" r:id="rIdJB37"/>
+          <w:footerReference w:type="default" r:id="rIdJB40"/>
+          <w:footerReference w:type="even" r:id="rIdJB40"/>
           <w:type w:val="continuous"/>
           <w:pgSz w:w="7920" w:h="12240"/>
           <w:pgMar w:top="1080" w:right="792" w:bottom="1008" w:left="1080" w:header="560" w:footer="500" w:gutter="0"/>
@@ -3438,7 +3807,9 @@
         </w:rPr>
         <w:sectPr>
           <w:headerReference w:type="default" r:id="rIdJB15"/>
-          <w:footerReference w:type="default" r:id="rId938"/>
+          <w:headerReference w:type="even" r:id="rIdJB15"/>
+          <w:footerReference w:type="default" r:id="rIdJB41"/>
+          <w:footerReference w:type="even" r:id="rIdJB41"/>
           <w:type w:val="continuous"/>
           <w:pgSz w:w="7920" w:h="12240"/>
           <w:pgMar w:top="1080" w:right="792" w:bottom="1008" w:left="1080" w:header="560" w:footer="500" w:gutter="0"/>
@@ -3634,18 +4005,37 @@
     </w:p>
     <w:p>
       <w:pPr>
+        <w:keepNext/>
         <w:pageBreakBefore/>
-        <w:spacing w:before="0" w:after="150" w:line="290" w:lineRule="auto"/>
-        <w:jc w:val="both"/>
-        <w:rPr>
-          <w:rFonts w:ascii="Palatino Linotype" w:hAnsi="Palatino Linotype" w:cs="Times New Roman"/>
-        </w:rPr>
-      </w:pPr>
-      <w:r>
-        <w:rPr>
-          <w:rFonts w:ascii="Palatino Linotype" w:hAnsi="Palatino Linotype" w:cs="Times New Roman"/>
-        </w:rPr>
-        <w:t xml:space="preserve">El tiempo es justamente un aspecto de la mente, que es como el recuerdo. El sentimiento que te genera el tiempo es muy importante encontrarlo. El sentimiento del tiempo, para que la gente lo pueda entender, es como el sentimiento de la gravedad. Vos, en este momento, no estás tan consciente de la gravedad —ahora te lo dije: sí, estás consciente de la gravedad—, pero imaginariamente, cuando vos vas a ver una imagen, no le ponés gravedad. La imagen está ahí, pero no le ponés gravedad. Cuando hablo de gravedad, no le ponés peso.</w:t>
+        <w:framePr w:dropCap="drop" w:lines="3" w:wrap="around" w:vAnchor="text" w:hAnchor="text"/>
+        <w:spacing w:before="0" w:after="0" w:line="880" w:lineRule="exact"/>
+        <w:textAlignment w:val="baseline"/>
+      </w:pPr>
+      <w:r>
+        <w:rPr>
+          <w:rFonts w:ascii="Palatino Linotype" w:hAnsi="Palatino Linotype" w:cs="Palatino Linotype"/>
+          <w:color w:val="2B2B2B"/>
+          <w:position w:val="-9"/>
+          <w:sz w:val="108"/>
+          <w:szCs w:val="108"/>
+          <w:lang w:val="es-AR"/>
+        </w:rPr>
+        <w:t xml:space="preserve">E</w:t>
+      </w:r>
+    </w:p>
+    <w:p>
+      <w:pPr>
+        <w:spacing w:before="0" w:after="150" w:line="290" w:lineRule="auto"/>
+        <w:jc w:val="both"/>
+        <w:rPr>
+          <w:rFonts w:ascii="Palatino Linotype" w:hAnsi="Palatino Linotype" w:cs="Times New Roman"/>
+        </w:rPr>
+      </w:pPr>
+      <w:r>
+        <w:rPr>
+          <w:rFonts w:ascii="Palatino Linotype" w:hAnsi="Palatino Linotype" w:cs="Times New Roman"/>
+        </w:rPr>
+        <w:t xml:space="preserve">l tiempo es justamente un aspecto de la mente, que es como el recuerdo. El sentimiento que te genera el tiempo es muy importante encontrarlo. El sentimiento del tiempo, para que la gente lo pueda entender, es como el sentimiento de la gravedad. Vos, en este momento, no estás tan consciente de la gravedad —ahora te lo dije: sí, estás consciente de la gravedad—, pero imaginariamente, cuando vos vas a ver una imagen, no le ponés gravedad. La imagen está ahí, pero no le ponés gravedad. Cuando hablo de gravedad, no le ponés peso.</w:t>
       </w:r>
     </w:p>
     <w:p>
@@ -3909,7 +4299,22 @@
         <w:rPr>
           <w:rFonts w:ascii="Palatino Linotype" w:hAnsi="Palatino Linotype" w:cs="Times New Roman"/>
         </w:rPr>
-        <w:t xml:space="preserve">Entonces, todo lo que es el aprender de afuera, la información, genera un estado, de alguna manera, de dopamina o de adicción a esa droga, a esa sensación de estar buscando constantemente la zanahoria. Entonces, ya cuando una persona vuelve a su interior, mira para adentro, tiene la intención... Vos decís: «¿qué es mirar para adentro?». No importa lo que sea mirar para adentro. Cuando tenés la intención de crear desde la mente, no desde las manos —ya cuando tenés la intención, no de buscar esta información y de escuchar a otro, sino de vos poner manos a la obra, pero desde la mente, no desde las manos—, paradójicamente, y ahí va el chiste, ya sos sanado de alguna forma, porque se necesita muchísima fuerza justamente para ese punto noventa y ocho, noventa y nueve, de información y de falsas creencias, y de pensar que sos lo que no sos, que sos tu máscara, que sos esto, que no sabés ni qué es el ego, si matar al ego, si amigarte con el ego, si ponerte de novio con el ego. No sabés qué hacer con el ego. Estás en ese punto.</w:t>
+        <w:t xml:space="preserve">Entonces, todo lo que es el aprender de afuera, la información, genera un estado, de alguna manera, de dopamina o de adicción a esa droga, a esa sensación de estar buscando constantemente la zanahoria. Entonces, ya cuando una persona vuelve a su interior, mira para adentro, tiene la intención... Vos decís: «¿qué es mirar para adentro?». No importa lo que sea mirar para adentro.</w:t>
+      </w:r>
+    </w:p>
+    <w:p>
+      <w:pPr>
+        <w:spacing w:before="0" w:after="150" w:line="290" w:lineRule="auto"/>
+        <w:jc w:val="both"/>
+        <w:rPr>
+          <w:rFonts w:ascii="Palatino Linotype" w:hAnsi="Palatino Linotype" w:cs="Times New Roman"/>
+        </w:rPr>
+      </w:pPr>
+      <w:r>
+        <w:rPr>
+          <w:rFonts w:ascii="Palatino Linotype" w:hAnsi="Palatino Linotype" w:cs="Times New Roman"/>
+        </w:rPr>
+        <w:t xml:space="preserve">Cuando tenés la intención de crear desde la mente, no desde las manos —ya cuando tenés la intención, no de buscar esta información y de escuchar a otro, sino de vos poner manos a la obra, pero desde la mente, no desde las manos—, paradójicamente, y ahí va el chiste, ya sos sanado de alguna forma, porque se necesita muchísima fuerza justamente para ese punto noventa y ocho, noventa y nueve, de información y de falsas creencias, y de pensar que sos lo que no sos, que sos tu máscara, que sos esto, que no sabés ni qué es el ego, si matar al ego, si amigarte con el ego, si ponerte de novio con el ego. No sabés qué hacer con el ego. Estás en ese punto.</w:t>
       </w:r>
     </w:p>
     <w:p>
@@ -3961,8 +4366,10 @@
       </w:r>
     </w:p>
     <w:sectPr>
-      <w:headerReference w:type="default" r:id="rIdJB14"/>
-      <w:footerReference w:type="default" r:id="rId938"/>
+      <w:headerReference w:type="default" r:id="rIdJB38"/>
+      <w:headerReference w:type="even" r:id="rIdJB39"/>
+      <w:footerReference w:type="default" r:id="rIdJB40"/>
+      <w:footerReference w:type="even" r:id="rIdJB40"/>
       <w:pgSz w:w="7920" w:h="12240"/>
       <w:pgMar w:top="1080" w:right="792" w:bottom="1008" w:left="1080" w:header="560" w:footer="500" w:gutter="0"/>
       <w:cols w:space="708"/>
@@ -4193,6 +4600,61 @@
         </wp:inline>
       </w:drawing>
     </w:r>
+  </w:p>
+</w:ftr>
+</file>
+
+<file path=word/footerJB.xml><?xml version="1.0" encoding="utf-8"?>
+<w:ftr xmlns:mc="http://schemas.openxmlformats.org/markup-compatibility/2006" xmlns:r="http://schemas.openxmlformats.org/officeDocument/2006/relationships" xmlns:wp="http://schemas.openxmlformats.org/drawingml/2006/wordprocessingDrawing" xmlns:a="http://schemas.openxmlformats.org/drawingml/2006/main" xmlns:pic="http://schemas.openxmlformats.org/drawingml/2006/picture" xmlns:w="http://schemas.openxmlformats.org/wordprocessingml/2006/main" xmlns:w14="http://schemas.microsoft.com/office/word/2010/wordml" mc:Ignorable="w14">
+  <w:p>
+    <w:pPr>
+      <w:jc w:val="center"/>
+    </w:pPr>
+    <w:r>
+      <w:rPr>
+        <w:rFonts w:ascii="Palatino Linotype" w:hAnsi="Palatino Linotype" w:cs="Palatino Linotype"/>
+        <w:color w:val="6E6A63"/>
+        <w:spacing w:val="0"/>
+        <w:sz w:val="17"/>
+        <w:szCs w:val="17"/>
+        <w:lang w:val="es-AR"/>
+      </w:rPr>
+      <w:t xml:space="preserve">·   </w:t>
+    </w:r>
+    <w:fldSimple w:instr=" PAGE ">
+      <w:r>
+        <w:rPr>
+          <w:rFonts w:ascii="Palatino Linotype" w:hAnsi="Palatino Linotype" w:cs="Palatino Linotype"/>
+          <w:color w:val="6E6A63"/>
+          <w:spacing w:val="20"/>
+          <w:sz w:val="17"/>
+          <w:szCs w:val="17"/>
+          <w:lang w:val="es-AR"/>
+        </w:rPr>
+        <w:t xml:space="preserve">1</w:t>
+      </w:r>
+    </w:fldSimple>
+    <w:r>
+      <w:rPr>
+        <w:rFonts w:ascii="Palatino Linotype" w:hAnsi="Palatino Linotype" w:cs="Palatino Linotype"/>
+        <w:color w:val="6E6A63"/>
+        <w:spacing w:val="0"/>
+        <w:sz w:val="17"/>
+        <w:szCs w:val="17"/>
+        <w:lang w:val="es-AR"/>
+      </w:rPr>
+      <w:t xml:space="preserve">   ·</w:t>
+    </w:r>
+  </w:p>
+</w:ftr>
+</file>
+
+<file path=word/footerJBvacio.xml><?xml version="1.0" encoding="utf-8"?>
+<w:ftr xmlns:mc="http://schemas.openxmlformats.org/markup-compatibility/2006" xmlns:r="http://schemas.openxmlformats.org/officeDocument/2006/relationships" xmlns:wp="http://schemas.openxmlformats.org/drawingml/2006/wordprocessingDrawing" xmlns:a="http://schemas.openxmlformats.org/drawingml/2006/main" xmlns:pic="http://schemas.openxmlformats.org/drawingml/2006/picture" xmlns:w="http://schemas.openxmlformats.org/wordprocessingml/2006/main" xmlns:w14="http://schemas.microsoft.com/office/word/2010/wordml" mc:Ignorable="w14">
+  <w:p>
+    <w:pPr>
+      <w:jc w:val="center"/>
+    </w:pPr>
   </w:p>
 </w:ftr>
 </file>
@@ -4865,6 +5327,1014 @@
           </a:graphic>
         </wp:inline>
       </w:drawing>
+    </w:r>
+  </w:p>
+</w:hdr>
+</file>
+
+<file path=word/headerJBimpar0.xml><?xml version="1.0" encoding="utf-8"?>
+<w:hdr xmlns:mc="http://schemas.openxmlformats.org/markup-compatibility/2006" xmlns:r="http://schemas.openxmlformats.org/officeDocument/2006/relationships" xmlns:wp="http://schemas.openxmlformats.org/drawingml/2006/wordprocessingDrawing" xmlns:a="http://schemas.openxmlformats.org/drawingml/2006/main" xmlns:pic="http://schemas.openxmlformats.org/drawingml/2006/picture" xmlns:w="http://schemas.openxmlformats.org/wordprocessingml/2006/main" xmlns:w14="http://schemas.microsoft.com/office/word/2010/wordml" mc:Ignorable="w14">
+  <w:p>
+    <w:pPr>
+      <w:jc w:val="right"/>
+    </w:pPr>
+    <w:r>
+      <w:rPr>
+        <w:rFonts w:ascii="Palatino Linotype" w:hAnsi="Palatino Linotype" w:cs="Palatino Linotype"/>
+        <w:color w:val="6E6A63"/>
+        <w:spacing w:val="60"/>
+        <w:sz w:val="15"/>
+        <w:szCs w:val="15"/>
+        <w:lang w:val="es-AR"/>
+      </w:rPr>
+      <w:t xml:space="preserve">LA PALABRA</w:t>
+    </w:r>
+    <w:r>
+      <w:rPr>
+        <w:rFonts w:ascii="Palatino Linotype" w:hAnsi="Palatino Linotype" w:cs="Palatino Linotype"/>
+        <w:color w:val="6E6A63"/>
+        <w:spacing w:val="60"/>
+        <w:sz w:val="15"/>
+        <w:szCs w:val="15"/>
+        <w:lang w:val="es-AR"/>
+      </w:rPr>
+      <w:t xml:space="preserve">   </w:t>
+    </w:r>
+    <w:r>
+      <w:rPr>
+        <w:position w:val="-6"/>
+      </w:rPr>
+      <w:drawing>
+        <wp:inline distT="0" distB="0" distL="0" distR="0">
+          <wp:extent cx="219456" cy="219456"/>
+          <wp:effectExtent l="0" t="0" r="0" b="0"/>
+          <wp:docPr id="9800" name="Emblema9800"/>
+          <wp:cNvGraphicFramePr>
+            <a:graphicFrameLocks noChangeAspect="1"/>
+          </wp:cNvGraphicFramePr>
+          <a:graphic>
+            <a:graphicData uri="http://schemas.openxmlformats.org/drawingml/2006/picture">
+              <pic:pic>
+                <pic:nvPicPr>
+                  <pic:cNvPr id="9800" name="Emblema9800"/>
+                  <pic:cNvPicPr/>
+                </pic:nvPicPr>
+                <pic:blipFill>
+                  <a:blip r:embed="rId1"/>
+                  <a:stretch>
+                    <a:fillRect/>
+                  </a:stretch>
+                </pic:blipFill>
+                <pic:spPr>
+                  <a:xfrm>
+                    <a:off x="0" y="0"/>
+                    <a:ext cx="219456" cy="219456"/>
+                  </a:xfrm>
+                  <a:prstGeom prst="rect">
+                    <a:avLst/>
+                  </a:prstGeom>
+                </pic:spPr>
+              </pic:pic>
+            </a:graphicData>
+          </a:graphic>
+        </wp:inline>
+      </w:drawing>
+    </w:r>
+  </w:p>
+</w:hdr>
+</file>
+
+<file path=word/headerJBimpar1.xml><?xml version="1.0" encoding="utf-8"?>
+<w:hdr xmlns:mc="http://schemas.openxmlformats.org/markup-compatibility/2006" xmlns:r="http://schemas.openxmlformats.org/officeDocument/2006/relationships" xmlns:wp="http://schemas.openxmlformats.org/drawingml/2006/wordprocessingDrawing" xmlns:a="http://schemas.openxmlformats.org/drawingml/2006/main" xmlns:pic="http://schemas.openxmlformats.org/drawingml/2006/picture" xmlns:w="http://schemas.openxmlformats.org/wordprocessingml/2006/main" xmlns:w14="http://schemas.microsoft.com/office/word/2010/wordml" mc:Ignorable="w14">
+  <w:p>
+    <w:pPr>
+      <w:jc w:val="right"/>
+    </w:pPr>
+    <w:r>
+      <w:rPr>
+        <w:rFonts w:ascii="Palatino Linotype" w:hAnsi="Palatino Linotype" w:cs="Palatino Linotype"/>
+        <w:color w:val="6E6A63"/>
+        <w:spacing w:val="60"/>
+        <w:sz w:val="15"/>
+        <w:szCs w:val="15"/>
+        <w:lang w:val="es-AR"/>
+      </w:rPr>
+      <w:t xml:space="preserve">LIBERTAD INTERNA</w:t>
+    </w:r>
+    <w:r>
+      <w:rPr>
+        <w:rFonts w:ascii="Palatino Linotype" w:hAnsi="Palatino Linotype" w:cs="Palatino Linotype"/>
+        <w:color w:val="6E6A63"/>
+        <w:spacing w:val="60"/>
+        <w:sz w:val="15"/>
+        <w:szCs w:val="15"/>
+        <w:lang w:val="es-AR"/>
+      </w:rPr>
+      <w:t xml:space="preserve">   </w:t>
+    </w:r>
+    <w:r>
+      <w:rPr>
+        <w:position w:val="-6"/>
+      </w:rPr>
+      <w:drawing>
+        <wp:inline distT="0" distB="0" distL="0" distR="0">
+          <wp:extent cx="219456" cy="219456"/>
+          <wp:effectExtent l="0" t="0" r="0" b="0"/>
+          <wp:docPr id="9801" name="Emblema9801"/>
+          <wp:cNvGraphicFramePr>
+            <a:graphicFrameLocks noChangeAspect="1"/>
+          </wp:cNvGraphicFramePr>
+          <a:graphic>
+            <a:graphicData uri="http://schemas.openxmlformats.org/drawingml/2006/picture">
+              <pic:pic>
+                <pic:nvPicPr>
+                  <pic:cNvPr id="9801" name="Emblema9801"/>
+                  <pic:cNvPicPr/>
+                </pic:nvPicPr>
+                <pic:blipFill>
+                  <a:blip r:embed="rId1"/>
+                  <a:stretch>
+                    <a:fillRect/>
+                  </a:stretch>
+                </pic:blipFill>
+                <pic:spPr>
+                  <a:xfrm>
+                    <a:off x="0" y="0"/>
+                    <a:ext cx="219456" cy="219456"/>
+                  </a:xfrm>
+                  <a:prstGeom prst="rect">
+                    <a:avLst/>
+                  </a:prstGeom>
+                </pic:spPr>
+              </pic:pic>
+            </a:graphicData>
+          </a:graphic>
+        </wp:inline>
+      </w:drawing>
+    </w:r>
+  </w:p>
+</w:hdr>
+</file>
+
+<file path=word/headerJBimpar2.xml><?xml version="1.0" encoding="utf-8"?>
+<w:hdr xmlns:mc="http://schemas.openxmlformats.org/markup-compatibility/2006" xmlns:r="http://schemas.openxmlformats.org/officeDocument/2006/relationships" xmlns:wp="http://schemas.openxmlformats.org/drawingml/2006/wordprocessingDrawing" xmlns:a="http://schemas.openxmlformats.org/drawingml/2006/main" xmlns:pic="http://schemas.openxmlformats.org/drawingml/2006/picture" xmlns:w="http://schemas.openxmlformats.org/wordprocessingml/2006/main" xmlns:w14="http://schemas.microsoft.com/office/word/2010/wordml" mc:Ignorable="w14">
+  <w:p>
+    <w:pPr>
+      <w:jc w:val="right"/>
+    </w:pPr>
+    <w:r>
+      <w:rPr>
+        <w:rFonts w:ascii="Palatino Linotype" w:hAnsi="Palatino Linotype" w:cs="Palatino Linotype"/>
+        <w:color w:val="6E6A63"/>
+        <w:spacing w:val="60"/>
+        <w:sz w:val="15"/>
+        <w:szCs w:val="15"/>
+        <w:lang w:val="es-AR"/>
+      </w:rPr>
+      <w:t xml:space="preserve">EL OBSERVADOR ETERNO</w:t>
+    </w:r>
+    <w:r>
+      <w:rPr>
+        <w:rFonts w:ascii="Palatino Linotype" w:hAnsi="Palatino Linotype" w:cs="Palatino Linotype"/>
+        <w:color w:val="6E6A63"/>
+        <w:spacing w:val="60"/>
+        <w:sz w:val="15"/>
+        <w:szCs w:val="15"/>
+        <w:lang w:val="es-AR"/>
+      </w:rPr>
+      <w:t xml:space="preserve">   </w:t>
+    </w:r>
+    <w:r>
+      <w:rPr>
+        <w:position w:val="-6"/>
+      </w:rPr>
+      <w:drawing>
+        <wp:inline distT="0" distB="0" distL="0" distR="0">
+          <wp:extent cx="219456" cy="219456"/>
+          <wp:effectExtent l="0" t="0" r="0" b="0"/>
+          <wp:docPr id="9802" name="Emblema9802"/>
+          <wp:cNvGraphicFramePr>
+            <a:graphicFrameLocks noChangeAspect="1"/>
+          </wp:cNvGraphicFramePr>
+          <a:graphic>
+            <a:graphicData uri="http://schemas.openxmlformats.org/drawingml/2006/picture">
+              <pic:pic>
+                <pic:nvPicPr>
+                  <pic:cNvPr id="9802" name="Emblema9802"/>
+                  <pic:cNvPicPr/>
+                </pic:nvPicPr>
+                <pic:blipFill>
+                  <a:blip r:embed="rId1"/>
+                  <a:stretch>
+                    <a:fillRect/>
+                  </a:stretch>
+                </pic:blipFill>
+                <pic:spPr>
+                  <a:xfrm>
+                    <a:off x="0" y="0"/>
+                    <a:ext cx="219456" cy="219456"/>
+                  </a:xfrm>
+                  <a:prstGeom prst="rect">
+                    <a:avLst/>
+                  </a:prstGeom>
+                </pic:spPr>
+              </pic:pic>
+            </a:graphicData>
+          </a:graphic>
+        </wp:inline>
+      </w:drawing>
+    </w:r>
+  </w:p>
+</w:hdr>
+</file>
+
+<file path=word/headerJBimpar3.xml><?xml version="1.0" encoding="utf-8"?>
+<w:hdr xmlns:mc="http://schemas.openxmlformats.org/markup-compatibility/2006" xmlns:r="http://schemas.openxmlformats.org/officeDocument/2006/relationships" xmlns:wp="http://schemas.openxmlformats.org/drawingml/2006/wordprocessingDrawing" xmlns:a="http://schemas.openxmlformats.org/drawingml/2006/main" xmlns:pic="http://schemas.openxmlformats.org/drawingml/2006/picture" xmlns:w="http://schemas.openxmlformats.org/wordprocessingml/2006/main" xmlns:w14="http://schemas.microsoft.com/office/word/2010/wordml" mc:Ignorable="w14">
+  <w:p>
+    <w:pPr>
+      <w:jc w:val="right"/>
+    </w:pPr>
+    <w:r>
+      <w:rPr>
+        <w:rFonts w:ascii="Palatino Linotype" w:hAnsi="Palatino Linotype" w:cs="Palatino Linotype"/>
+        <w:color w:val="6E6A63"/>
+        <w:spacing w:val="60"/>
+        <w:sz w:val="15"/>
+        <w:szCs w:val="15"/>
+        <w:lang w:val="es-AR"/>
+      </w:rPr>
+      <w:t xml:space="preserve">CONVERSACIONES SINCERAS</w:t>
+    </w:r>
+    <w:r>
+      <w:rPr>
+        <w:rFonts w:ascii="Palatino Linotype" w:hAnsi="Palatino Linotype" w:cs="Palatino Linotype"/>
+        <w:color w:val="6E6A63"/>
+        <w:spacing w:val="60"/>
+        <w:sz w:val="15"/>
+        <w:szCs w:val="15"/>
+        <w:lang w:val="es-AR"/>
+      </w:rPr>
+      <w:t xml:space="preserve">   </w:t>
+    </w:r>
+    <w:r>
+      <w:rPr>
+        <w:position w:val="-6"/>
+      </w:rPr>
+      <w:drawing>
+        <wp:inline distT="0" distB="0" distL="0" distR="0">
+          <wp:extent cx="219456" cy="219456"/>
+          <wp:effectExtent l="0" t="0" r="0" b="0"/>
+          <wp:docPr id="9803" name="Emblema9803"/>
+          <wp:cNvGraphicFramePr>
+            <a:graphicFrameLocks noChangeAspect="1"/>
+          </wp:cNvGraphicFramePr>
+          <a:graphic>
+            <a:graphicData uri="http://schemas.openxmlformats.org/drawingml/2006/picture">
+              <pic:pic>
+                <pic:nvPicPr>
+                  <pic:cNvPr id="9803" name="Emblema9803"/>
+                  <pic:cNvPicPr/>
+                </pic:nvPicPr>
+                <pic:blipFill>
+                  <a:blip r:embed="rId1"/>
+                  <a:stretch>
+                    <a:fillRect/>
+                  </a:stretch>
+                </pic:blipFill>
+                <pic:spPr>
+                  <a:xfrm>
+                    <a:off x="0" y="0"/>
+                    <a:ext cx="219456" cy="219456"/>
+                  </a:xfrm>
+                  <a:prstGeom prst="rect">
+                    <a:avLst/>
+                  </a:prstGeom>
+                </pic:spPr>
+              </pic:pic>
+            </a:graphicData>
+          </a:graphic>
+        </wp:inline>
+      </w:drawing>
+    </w:r>
+  </w:p>
+</w:hdr>
+</file>
+
+<file path=word/headerJBimpar4.xml><?xml version="1.0" encoding="utf-8"?>
+<w:hdr xmlns:mc="http://schemas.openxmlformats.org/markup-compatibility/2006" xmlns:r="http://schemas.openxmlformats.org/officeDocument/2006/relationships" xmlns:wp="http://schemas.openxmlformats.org/drawingml/2006/wordprocessingDrawing" xmlns:a="http://schemas.openxmlformats.org/drawingml/2006/main" xmlns:pic="http://schemas.openxmlformats.org/drawingml/2006/picture" xmlns:w="http://schemas.openxmlformats.org/wordprocessingml/2006/main" xmlns:w14="http://schemas.microsoft.com/office/word/2010/wordml" mc:Ignorable="w14">
+  <w:p>
+    <w:pPr>
+      <w:jc w:val="right"/>
+    </w:pPr>
+    <w:r>
+      <w:rPr>
+        <w:rFonts w:ascii="Palatino Linotype" w:hAnsi="Palatino Linotype" w:cs="Palatino Linotype"/>
+        <w:color w:val="6E6A63"/>
+        <w:spacing w:val="60"/>
+        <w:sz w:val="15"/>
+        <w:szCs w:val="15"/>
+        <w:lang w:val="es-AR"/>
+      </w:rPr>
+      <w:t xml:space="preserve">LA INTELIGENCIA NATURAL</w:t>
+    </w:r>
+    <w:r>
+      <w:rPr>
+        <w:rFonts w:ascii="Palatino Linotype" w:hAnsi="Palatino Linotype" w:cs="Palatino Linotype"/>
+        <w:color w:val="6E6A63"/>
+        <w:spacing w:val="60"/>
+        <w:sz w:val="15"/>
+        <w:szCs w:val="15"/>
+        <w:lang w:val="es-AR"/>
+      </w:rPr>
+      <w:t xml:space="preserve">   </w:t>
+    </w:r>
+    <w:r>
+      <w:rPr>
+        <w:position w:val="-6"/>
+      </w:rPr>
+      <w:drawing>
+        <wp:inline distT="0" distB="0" distL="0" distR="0">
+          <wp:extent cx="219456" cy="219456"/>
+          <wp:effectExtent l="0" t="0" r="0" b="0"/>
+          <wp:docPr id="9804" name="Emblema9804"/>
+          <wp:cNvGraphicFramePr>
+            <a:graphicFrameLocks noChangeAspect="1"/>
+          </wp:cNvGraphicFramePr>
+          <a:graphic>
+            <a:graphicData uri="http://schemas.openxmlformats.org/drawingml/2006/picture">
+              <pic:pic>
+                <pic:nvPicPr>
+                  <pic:cNvPr id="9804" name="Emblema9804"/>
+                  <pic:cNvPicPr/>
+                </pic:nvPicPr>
+                <pic:blipFill>
+                  <a:blip r:embed="rId1"/>
+                  <a:stretch>
+                    <a:fillRect/>
+                  </a:stretch>
+                </pic:blipFill>
+                <pic:spPr>
+                  <a:xfrm>
+                    <a:off x="0" y="0"/>
+                    <a:ext cx="219456" cy="219456"/>
+                  </a:xfrm>
+                  <a:prstGeom prst="rect">
+                    <a:avLst/>
+                  </a:prstGeom>
+                </pic:spPr>
+              </pic:pic>
+            </a:graphicData>
+          </a:graphic>
+        </wp:inline>
+      </w:drawing>
+    </w:r>
+  </w:p>
+</w:hdr>
+</file>
+
+<file path=word/headerJBimpar5.xml><?xml version="1.0" encoding="utf-8"?>
+<w:hdr xmlns:mc="http://schemas.openxmlformats.org/markup-compatibility/2006" xmlns:r="http://schemas.openxmlformats.org/officeDocument/2006/relationships" xmlns:wp="http://schemas.openxmlformats.org/drawingml/2006/wordprocessingDrawing" xmlns:a="http://schemas.openxmlformats.org/drawingml/2006/main" xmlns:pic="http://schemas.openxmlformats.org/drawingml/2006/picture" xmlns:w="http://schemas.openxmlformats.org/wordprocessingml/2006/main" xmlns:w14="http://schemas.microsoft.com/office/word/2010/wordml" mc:Ignorable="w14">
+  <w:p>
+    <w:pPr>
+      <w:jc w:val="right"/>
+    </w:pPr>
+    <w:r>
+      <w:rPr>
+        <w:rFonts w:ascii="Palatino Linotype" w:hAnsi="Palatino Linotype" w:cs="Palatino Linotype"/>
+        <w:color w:val="6E6A63"/>
+        <w:spacing w:val="60"/>
+        <w:sz w:val="15"/>
+        <w:szCs w:val="15"/>
+        <w:lang w:val="es-AR"/>
+      </w:rPr>
+      <w:t xml:space="preserve">ARQUETIPOS</w:t>
+    </w:r>
+    <w:r>
+      <w:rPr>
+        <w:rFonts w:ascii="Palatino Linotype" w:hAnsi="Palatino Linotype" w:cs="Palatino Linotype"/>
+        <w:color w:val="6E6A63"/>
+        <w:spacing w:val="60"/>
+        <w:sz w:val="15"/>
+        <w:szCs w:val="15"/>
+        <w:lang w:val="es-AR"/>
+      </w:rPr>
+      <w:t xml:space="preserve">   </w:t>
+    </w:r>
+    <w:r>
+      <w:rPr>
+        <w:position w:val="-6"/>
+      </w:rPr>
+      <w:drawing>
+        <wp:inline distT="0" distB="0" distL="0" distR="0">
+          <wp:extent cx="219456" cy="219456"/>
+          <wp:effectExtent l="0" t="0" r="0" b="0"/>
+          <wp:docPr id="9805" name="Emblema9805"/>
+          <wp:cNvGraphicFramePr>
+            <a:graphicFrameLocks noChangeAspect="1"/>
+          </wp:cNvGraphicFramePr>
+          <a:graphic>
+            <a:graphicData uri="http://schemas.openxmlformats.org/drawingml/2006/picture">
+              <pic:pic>
+                <pic:nvPicPr>
+                  <pic:cNvPr id="9805" name="Emblema9805"/>
+                  <pic:cNvPicPr/>
+                </pic:nvPicPr>
+                <pic:blipFill>
+                  <a:blip r:embed="rId1"/>
+                  <a:stretch>
+                    <a:fillRect/>
+                  </a:stretch>
+                </pic:blipFill>
+                <pic:spPr>
+                  <a:xfrm>
+                    <a:off x="0" y="0"/>
+                    <a:ext cx="219456" cy="219456"/>
+                  </a:xfrm>
+                  <a:prstGeom prst="rect">
+                    <a:avLst/>
+                  </a:prstGeom>
+                </pic:spPr>
+              </pic:pic>
+            </a:graphicData>
+          </a:graphic>
+        </wp:inline>
+      </w:drawing>
+    </w:r>
+  </w:p>
+</w:hdr>
+</file>
+
+<file path=word/headerJBimpar6.xml><?xml version="1.0" encoding="utf-8"?>
+<w:hdr xmlns:mc="http://schemas.openxmlformats.org/markup-compatibility/2006" xmlns:r="http://schemas.openxmlformats.org/officeDocument/2006/relationships" xmlns:wp="http://schemas.openxmlformats.org/drawingml/2006/wordprocessingDrawing" xmlns:a="http://schemas.openxmlformats.org/drawingml/2006/main" xmlns:pic="http://schemas.openxmlformats.org/drawingml/2006/picture" xmlns:w="http://schemas.openxmlformats.org/wordprocessingml/2006/main" xmlns:w14="http://schemas.microsoft.com/office/word/2010/wordml" mc:Ignorable="w14">
+  <w:p>
+    <w:pPr>
+      <w:jc w:val="right"/>
+    </w:pPr>
+    <w:r>
+      <w:rPr>
+        <w:rFonts w:ascii="Palatino Linotype" w:hAnsi="Palatino Linotype" w:cs="Palatino Linotype"/>
+        <w:color w:val="6E6A63"/>
+        <w:spacing w:val="60"/>
+        <w:sz w:val="15"/>
+        <w:szCs w:val="15"/>
+        <w:lang w:val="es-AR"/>
+      </w:rPr>
+      <w:t xml:space="preserve">ATRAVESAR EL TIEMPO</w:t>
+    </w:r>
+    <w:r>
+      <w:rPr>
+        <w:rFonts w:ascii="Palatino Linotype" w:hAnsi="Palatino Linotype" w:cs="Palatino Linotype"/>
+        <w:color w:val="6E6A63"/>
+        <w:spacing w:val="60"/>
+        <w:sz w:val="15"/>
+        <w:szCs w:val="15"/>
+        <w:lang w:val="es-AR"/>
+      </w:rPr>
+      <w:t xml:space="preserve">   </w:t>
+    </w:r>
+    <w:r>
+      <w:rPr>
+        <w:position w:val="-6"/>
+      </w:rPr>
+      <w:drawing>
+        <wp:inline distT="0" distB="0" distL="0" distR="0">
+          <wp:extent cx="219456" cy="219456"/>
+          <wp:effectExtent l="0" t="0" r="0" b="0"/>
+          <wp:docPr id="9806" name="Emblema9806"/>
+          <wp:cNvGraphicFramePr>
+            <a:graphicFrameLocks noChangeAspect="1"/>
+          </wp:cNvGraphicFramePr>
+          <a:graphic>
+            <a:graphicData uri="http://schemas.openxmlformats.org/drawingml/2006/picture">
+              <pic:pic>
+                <pic:nvPicPr>
+                  <pic:cNvPr id="9806" name="Emblema9806"/>
+                  <pic:cNvPicPr/>
+                </pic:nvPicPr>
+                <pic:blipFill>
+                  <a:blip r:embed="rId1"/>
+                  <a:stretch>
+                    <a:fillRect/>
+                  </a:stretch>
+                </pic:blipFill>
+                <pic:spPr>
+                  <a:xfrm>
+                    <a:off x="0" y="0"/>
+                    <a:ext cx="219456" cy="219456"/>
+                  </a:xfrm>
+                  <a:prstGeom prst="rect">
+                    <a:avLst/>
+                  </a:prstGeom>
+                </pic:spPr>
+              </pic:pic>
+            </a:graphicData>
+          </a:graphic>
+        </wp:inline>
+      </w:drawing>
+    </w:r>
+  </w:p>
+</w:hdr>
+</file>
+
+<file path=word/headerJBpar0.xml><?xml version="1.0" encoding="utf-8"?>
+<w:hdr xmlns:mc="http://schemas.openxmlformats.org/markup-compatibility/2006" xmlns:r="http://schemas.openxmlformats.org/officeDocument/2006/relationships" xmlns:wp="http://schemas.openxmlformats.org/drawingml/2006/wordprocessingDrawing" xmlns:a="http://schemas.openxmlformats.org/drawingml/2006/main" xmlns:pic="http://schemas.openxmlformats.org/drawingml/2006/picture" xmlns:w="http://schemas.openxmlformats.org/wordprocessingml/2006/main" xmlns:w14="http://schemas.microsoft.com/office/word/2010/wordml" mc:Ignorable="w14">
+  <w:p>
+    <w:pPr>
+      <w:jc w:val="left"/>
+    </w:pPr>
+    <w:r>
+      <w:rPr>
+        <w:position w:val="-6"/>
+      </w:rPr>
+      <w:drawing>
+        <wp:inline distT="0" distB="0" distL="0" distR="0">
+          <wp:extent cx="219456" cy="219456"/>
+          <wp:effectExtent l="0" t="0" r="0" b="0"/>
+          <wp:docPr id="9850" name="Emblema9850"/>
+          <wp:cNvGraphicFramePr>
+            <a:graphicFrameLocks noChangeAspect="1"/>
+          </wp:cNvGraphicFramePr>
+          <a:graphic>
+            <a:graphicData uri="http://schemas.openxmlformats.org/drawingml/2006/picture">
+              <pic:pic>
+                <pic:nvPicPr>
+                  <pic:cNvPr id="9850" name="Emblema9850"/>
+                  <pic:cNvPicPr/>
+                </pic:nvPicPr>
+                <pic:blipFill>
+                  <a:blip r:embed="rId1"/>
+                  <a:stretch>
+                    <a:fillRect/>
+                  </a:stretch>
+                </pic:blipFill>
+                <pic:spPr>
+                  <a:xfrm>
+                    <a:off x="0" y="0"/>
+                    <a:ext cx="219456" cy="219456"/>
+                  </a:xfrm>
+                  <a:prstGeom prst="rect">
+                    <a:avLst/>
+                  </a:prstGeom>
+                </pic:spPr>
+              </pic:pic>
+            </a:graphicData>
+          </a:graphic>
+        </wp:inline>
+      </w:drawing>
+    </w:r>
+    <w:r>
+      <w:rPr>
+        <w:rFonts w:ascii="Palatino Linotype" w:hAnsi="Palatino Linotype" w:cs="Palatino Linotype"/>
+        <w:color w:val="6E6A63"/>
+        <w:spacing w:val="60"/>
+        <w:sz w:val="15"/>
+        <w:szCs w:val="15"/>
+        <w:lang w:val="es-AR"/>
+      </w:rPr>
+      <w:t xml:space="preserve">   </w:t>
+    </w:r>
+    <w:r>
+      <w:rPr>
+        <w:rFonts w:ascii="Palatino Linotype" w:hAnsi="Palatino Linotype" w:cs="Palatino Linotype"/>
+        <w:color w:val="6E6A63"/>
+        <w:spacing w:val="60"/>
+        <w:sz w:val="15"/>
+        <w:szCs w:val="15"/>
+        <w:lang w:val="es-AR"/>
+      </w:rPr>
+      <w:t xml:space="preserve">EL PENSAMIENTO ES TU FE</w:t>
+    </w:r>
+  </w:p>
+</w:hdr>
+</file>
+
+<file path=word/headerJBpar1.xml><?xml version="1.0" encoding="utf-8"?>
+<w:hdr xmlns:mc="http://schemas.openxmlformats.org/markup-compatibility/2006" xmlns:r="http://schemas.openxmlformats.org/officeDocument/2006/relationships" xmlns:wp="http://schemas.openxmlformats.org/drawingml/2006/wordprocessingDrawing" xmlns:a="http://schemas.openxmlformats.org/drawingml/2006/main" xmlns:pic="http://schemas.openxmlformats.org/drawingml/2006/picture" xmlns:w="http://schemas.openxmlformats.org/wordprocessingml/2006/main" xmlns:w14="http://schemas.microsoft.com/office/word/2010/wordml" mc:Ignorable="w14">
+  <w:p>
+    <w:pPr>
+      <w:jc w:val="left"/>
+    </w:pPr>
+    <w:r>
+      <w:rPr>
+        <w:position w:val="-6"/>
+      </w:rPr>
+      <w:drawing>
+        <wp:inline distT="0" distB="0" distL="0" distR="0">
+          <wp:extent cx="219456" cy="219456"/>
+          <wp:effectExtent l="0" t="0" r="0" b="0"/>
+          <wp:docPr id="9851" name="Emblema9851"/>
+          <wp:cNvGraphicFramePr>
+            <a:graphicFrameLocks noChangeAspect="1"/>
+          </wp:cNvGraphicFramePr>
+          <a:graphic>
+            <a:graphicData uri="http://schemas.openxmlformats.org/drawingml/2006/picture">
+              <pic:pic>
+                <pic:nvPicPr>
+                  <pic:cNvPr id="9851" name="Emblema9851"/>
+                  <pic:cNvPicPr/>
+                </pic:nvPicPr>
+                <pic:blipFill>
+                  <a:blip r:embed="rId1"/>
+                  <a:stretch>
+                    <a:fillRect/>
+                  </a:stretch>
+                </pic:blipFill>
+                <pic:spPr>
+                  <a:xfrm>
+                    <a:off x="0" y="0"/>
+                    <a:ext cx="219456" cy="219456"/>
+                  </a:xfrm>
+                  <a:prstGeom prst="rect">
+                    <a:avLst/>
+                  </a:prstGeom>
+                </pic:spPr>
+              </pic:pic>
+            </a:graphicData>
+          </a:graphic>
+        </wp:inline>
+      </w:drawing>
+    </w:r>
+    <w:r>
+      <w:rPr>
+        <w:rFonts w:ascii="Palatino Linotype" w:hAnsi="Palatino Linotype" w:cs="Palatino Linotype"/>
+        <w:color w:val="6E6A63"/>
+        <w:spacing w:val="60"/>
+        <w:sz w:val="15"/>
+        <w:szCs w:val="15"/>
+        <w:lang w:val="es-AR"/>
+      </w:rPr>
+      <w:t xml:space="preserve">   </w:t>
+    </w:r>
+    <w:r>
+      <w:rPr>
+        <w:rFonts w:ascii="Palatino Linotype" w:hAnsi="Palatino Linotype" w:cs="Palatino Linotype"/>
+        <w:color w:val="6E6A63"/>
+        <w:spacing w:val="60"/>
+        <w:sz w:val="15"/>
+        <w:szCs w:val="15"/>
+        <w:lang w:val="es-AR"/>
+      </w:rPr>
+      <w:t xml:space="preserve">EL PENSAMIENTO ES TU FE</w:t>
+    </w:r>
+  </w:p>
+</w:hdr>
+</file>
+
+<file path=word/headerJBpar2.xml><?xml version="1.0" encoding="utf-8"?>
+<w:hdr xmlns:mc="http://schemas.openxmlformats.org/markup-compatibility/2006" xmlns:r="http://schemas.openxmlformats.org/officeDocument/2006/relationships" xmlns:wp="http://schemas.openxmlformats.org/drawingml/2006/wordprocessingDrawing" xmlns:a="http://schemas.openxmlformats.org/drawingml/2006/main" xmlns:pic="http://schemas.openxmlformats.org/drawingml/2006/picture" xmlns:w="http://schemas.openxmlformats.org/wordprocessingml/2006/main" xmlns:w14="http://schemas.microsoft.com/office/word/2010/wordml" mc:Ignorable="w14">
+  <w:p>
+    <w:pPr>
+      <w:jc w:val="left"/>
+    </w:pPr>
+    <w:r>
+      <w:rPr>
+        <w:position w:val="-6"/>
+      </w:rPr>
+      <w:drawing>
+        <wp:inline distT="0" distB="0" distL="0" distR="0">
+          <wp:extent cx="219456" cy="219456"/>
+          <wp:effectExtent l="0" t="0" r="0" b="0"/>
+          <wp:docPr id="9852" name="Emblema9852"/>
+          <wp:cNvGraphicFramePr>
+            <a:graphicFrameLocks noChangeAspect="1"/>
+          </wp:cNvGraphicFramePr>
+          <a:graphic>
+            <a:graphicData uri="http://schemas.openxmlformats.org/drawingml/2006/picture">
+              <pic:pic>
+                <pic:nvPicPr>
+                  <pic:cNvPr id="9852" name="Emblema9852"/>
+                  <pic:cNvPicPr/>
+                </pic:nvPicPr>
+                <pic:blipFill>
+                  <a:blip r:embed="rId1"/>
+                  <a:stretch>
+                    <a:fillRect/>
+                  </a:stretch>
+                </pic:blipFill>
+                <pic:spPr>
+                  <a:xfrm>
+                    <a:off x="0" y="0"/>
+                    <a:ext cx="219456" cy="219456"/>
+                  </a:xfrm>
+                  <a:prstGeom prst="rect">
+                    <a:avLst/>
+                  </a:prstGeom>
+                </pic:spPr>
+              </pic:pic>
+            </a:graphicData>
+          </a:graphic>
+        </wp:inline>
+      </w:drawing>
+    </w:r>
+    <w:r>
+      <w:rPr>
+        <w:rFonts w:ascii="Palatino Linotype" w:hAnsi="Palatino Linotype" w:cs="Palatino Linotype"/>
+        <w:color w:val="6E6A63"/>
+        <w:spacing w:val="60"/>
+        <w:sz w:val="15"/>
+        <w:szCs w:val="15"/>
+        <w:lang w:val="es-AR"/>
+      </w:rPr>
+      <w:t xml:space="preserve">   </w:t>
+    </w:r>
+    <w:r>
+      <w:rPr>
+        <w:rFonts w:ascii="Palatino Linotype" w:hAnsi="Palatino Linotype" w:cs="Palatino Linotype"/>
+        <w:color w:val="6E6A63"/>
+        <w:spacing w:val="60"/>
+        <w:sz w:val="15"/>
+        <w:szCs w:val="15"/>
+        <w:lang w:val="es-AR"/>
+      </w:rPr>
+      <w:t xml:space="preserve">EL PENSAMIENTO ES TU FE</w:t>
+    </w:r>
+  </w:p>
+</w:hdr>
+</file>
+
+<file path=word/headerJBpar3.xml><?xml version="1.0" encoding="utf-8"?>
+<w:hdr xmlns:mc="http://schemas.openxmlformats.org/markup-compatibility/2006" xmlns:r="http://schemas.openxmlformats.org/officeDocument/2006/relationships" xmlns:wp="http://schemas.openxmlformats.org/drawingml/2006/wordprocessingDrawing" xmlns:a="http://schemas.openxmlformats.org/drawingml/2006/main" xmlns:pic="http://schemas.openxmlformats.org/drawingml/2006/picture" xmlns:w="http://schemas.openxmlformats.org/wordprocessingml/2006/main" xmlns:w14="http://schemas.microsoft.com/office/word/2010/wordml" mc:Ignorable="w14">
+  <w:p>
+    <w:pPr>
+      <w:jc w:val="left"/>
+    </w:pPr>
+    <w:r>
+      <w:rPr>
+        <w:position w:val="-6"/>
+      </w:rPr>
+      <w:drawing>
+        <wp:inline distT="0" distB="0" distL="0" distR="0">
+          <wp:extent cx="219456" cy="219456"/>
+          <wp:effectExtent l="0" t="0" r="0" b="0"/>
+          <wp:docPr id="9853" name="Emblema9853"/>
+          <wp:cNvGraphicFramePr>
+            <a:graphicFrameLocks noChangeAspect="1"/>
+          </wp:cNvGraphicFramePr>
+          <a:graphic>
+            <a:graphicData uri="http://schemas.openxmlformats.org/drawingml/2006/picture">
+              <pic:pic>
+                <pic:nvPicPr>
+                  <pic:cNvPr id="9853" name="Emblema9853"/>
+                  <pic:cNvPicPr/>
+                </pic:nvPicPr>
+                <pic:blipFill>
+                  <a:blip r:embed="rId1"/>
+                  <a:stretch>
+                    <a:fillRect/>
+                  </a:stretch>
+                </pic:blipFill>
+                <pic:spPr>
+                  <a:xfrm>
+                    <a:off x="0" y="0"/>
+                    <a:ext cx="219456" cy="219456"/>
+                  </a:xfrm>
+                  <a:prstGeom prst="rect">
+                    <a:avLst/>
+                  </a:prstGeom>
+                </pic:spPr>
+              </pic:pic>
+            </a:graphicData>
+          </a:graphic>
+        </wp:inline>
+      </w:drawing>
+    </w:r>
+    <w:r>
+      <w:rPr>
+        <w:rFonts w:ascii="Palatino Linotype" w:hAnsi="Palatino Linotype" w:cs="Palatino Linotype"/>
+        <w:color w:val="6E6A63"/>
+        <w:spacing w:val="60"/>
+        <w:sz w:val="15"/>
+        <w:szCs w:val="15"/>
+        <w:lang w:val="es-AR"/>
+      </w:rPr>
+      <w:t xml:space="preserve">   </w:t>
+    </w:r>
+    <w:r>
+      <w:rPr>
+        <w:rFonts w:ascii="Palatino Linotype" w:hAnsi="Palatino Linotype" w:cs="Palatino Linotype"/>
+        <w:color w:val="6E6A63"/>
+        <w:spacing w:val="60"/>
+        <w:sz w:val="15"/>
+        <w:szCs w:val="15"/>
+        <w:lang w:val="es-AR"/>
+      </w:rPr>
+      <w:t xml:space="preserve">EL PENSAMIENTO ES TU FE</w:t>
+    </w:r>
+  </w:p>
+</w:hdr>
+</file>
+
+<file path=word/headerJBpar4.xml><?xml version="1.0" encoding="utf-8"?>
+<w:hdr xmlns:mc="http://schemas.openxmlformats.org/markup-compatibility/2006" xmlns:r="http://schemas.openxmlformats.org/officeDocument/2006/relationships" xmlns:wp="http://schemas.openxmlformats.org/drawingml/2006/wordprocessingDrawing" xmlns:a="http://schemas.openxmlformats.org/drawingml/2006/main" xmlns:pic="http://schemas.openxmlformats.org/drawingml/2006/picture" xmlns:w="http://schemas.openxmlformats.org/wordprocessingml/2006/main" xmlns:w14="http://schemas.microsoft.com/office/word/2010/wordml" mc:Ignorable="w14">
+  <w:p>
+    <w:pPr>
+      <w:jc w:val="left"/>
+    </w:pPr>
+    <w:r>
+      <w:rPr>
+        <w:position w:val="-6"/>
+      </w:rPr>
+      <w:drawing>
+        <wp:inline distT="0" distB="0" distL="0" distR="0">
+          <wp:extent cx="219456" cy="219456"/>
+          <wp:effectExtent l="0" t="0" r="0" b="0"/>
+          <wp:docPr id="9854" name="Emblema9854"/>
+          <wp:cNvGraphicFramePr>
+            <a:graphicFrameLocks noChangeAspect="1"/>
+          </wp:cNvGraphicFramePr>
+          <a:graphic>
+            <a:graphicData uri="http://schemas.openxmlformats.org/drawingml/2006/picture">
+              <pic:pic>
+                <pic:nvPicPr>
+                  <pic:cNvPr id="9854" name="Emblema9854"/>
+                  <pic:cNvPicPr/>
+                </pic:nvPicPr>
+                <pic:blipFill>
+                  <a:blip r:embed="rId1"/>
+                  <a:stretch>
+                    <a:fillRect/>
+                  </a:stretch>
+                </pic:blipFill>
+                <pic:spPr>
+                  <a:xfrm>
+                    <a:off x="0" y="0"/>
+                    <a:ext cx="219456" cy="219456"/>
+                  </a:xfrm>
+                  <a:prstGeom prst="rect">
+                    <a:avLst/>
+                  </a:prstGeom>
+                </pic:spPr>
+              </pic:pic>
+            </a:graphicData>
+          </a:graphic>
+        </wp:inline>
+      </w:drawing>
+    </w:r>
+    <w:r>
+      <w:rPr>
+        <w:rFonts w:ascii="Palatino Linotype" w:hAnsi="Palatino Linotype" w:cs="Palatino Linotype"/>
+        <w:color w:val="6E6A63"/>
+        <w:spacing w:val="60"/>
+        <w:sz w:val="15"/>
+        <w:szCs w:val="15"/>
+        <w:lang w:val="es-AR"/>
+      </w:rPr>
+      <w:t xml:space="preserve">   </w:t>
+    </w:r>
+    <w:r>
+      <w:rPr>
+        <w:rFonts w:ascii="Palatino Linotype" w:hAnsi="Palatino Linotype" w:cs="Palatino Linotype"/>
+        <w:color w:val="6E6A63"/>
+        <w:spacing w:val="60"/>
+        <w:sz w:val="15"/>
+        <w:szCs w:val="15"/>
+        <w:lang w:val="es-AR"/>
+      </w:rPr>
+      <w:t xml:space="preserve">EL PENSAMIENTO ES TU FE</w:t>
+    </w:r>
+  </w:p>
+</w:hdr>
+</file>
+
+<file path=word/headerJBpar5.xml><?xml version="1.0" encoding="utf-8"?>
+<w:hdr xmlns:mc="http://schemas.openxmlformats.org/markup-compatibility/2006" xmlns:r="http://schemas.openxmlformats.org/officeDocument/2006/relationships" xmlns:wp="http://schemas.openxmlformats.org/drawingml/2006/wordprocessingDrawing" xmlns:a="http://schemas.openxmlformats.org/drawingml/2006/main" xmlns:pic="http://schemas.openxmlformats.org/drawingml/2006/picture" xmlns:w="http://schemas.openxmlformats.org/wordprocessingml/2006/main" xmlns:w14="http://schemas.microsoft.com/office/word/2010/wordml" mc:Ignorable="w14">
+  <w:p>
+    <w:pPr>
+      <w:jc w:val="left"/>
+    </w:pPr>
+    <w:r>
+      <w:rPr>
+        <w:position w:val="-6"/>
+      </w:rPr>
+      <w:drawing>
+        <wp:inline distT="0" distB="0" distL="0" distR="0">
+          <wp:extent cx="219456" cy="219456"/>
+          <wp:effectExtent l="0" t="0" r="0" b="0"/>
+          <wp:docPr id="9855" name="Emblema9855"/>
+          <wp:cNvGraphicFramePr>
+            <a:graphicFrameLocks noChangeAspect="1"/>
+          </wp:cNvGraphicFramePr>
+          <a:graphic>
+            <a:graphicData uri="http://schemas.openxmlformats.org/drawingml/2006/picture">
+              <pic:pic>
+                <pic:nvPicPr>
+                  <pic:cNvPr id="9855" name="Emblema9855"/>
+                  <pic:cNvPicPr/>
+                </pic:nvPicPr>
+                <pic:blipFill>
+                  <a:blip r:embed="rId1"/>
+                  <a:stretch>
+                    <a:fillRect/>
+                  </a:stretch>
+                </pic:blipFill>
+                <pic:spPr>
+                  <a:xfrm>
+                    <a:off x="0" y="0"/>
+                    <a:ext cx="219456" cy="219456"/>
+                  </a:xfrm>
+                  <a:prstGeom prst="rect">
+                    <a:avLst/>
+                  </a:prstGeom>
+                </pic:spPr>
+              </pic:pic>
+            </a:graphicData>
+          </a:graphic>
+        </wp:inline>
+      </w:drawing>
+    </w:r>
+    <w:r>
+      <w:rPr>
+        <w:rFonts w:ascii="Palatino Linotype" w:hAnsi="Palatino Linotype" w:cs="Palatino Linotype"/>
+        <w:color w:val="6E6A63"/>
+        <w:spacing w:val="60"/>
+        <w:sz w:val="15"/>
+        <w:szCs w:val="15"/>
+        <w:lang w:val="es-AR"/>
+      </w:rPr>
+      <w:t xml:space="preserve">   </w:t>
+    </w:r>
+    <w:r>
+      <w:rPr>
+        <w:rFonts w:ascii="Palatino Linotype" w:hAnsi="Palatino Linotype" w:cs="Palatino Linotype"/>
+        <w:color w:val="6E6A63"/>
+        <w:spacing w:val="60"/>
+        <w:sz w:val="15"/>
+        <w:szCs w:val="15"/>
+        <w:lang w:val="es-AR"/>
+      </w:rPr>
+      <w:t xml:space="preserve">EL PENSAMIENTO ES TU FE</w:t>
+    </w:r>
+  </w:p>
+</w:hdr>
+</file>
+
+<file path=word/headerJBpar6.xml><?xml version="1.0" encoding="utf-8"?>
+<w:hdr xmlns:mc="http://schemas.openxmlformats.org/markup-compatibility/2006" xmlns:r="http://schemas.openxmlformats.org/officeDocument/2006/relationships" xmlns:wp="http://schemas.openxmlformats.org/drawingml/2006/wordprocessingDrawing" xmlns:a="http://schemas.openxmlformats.org/drawingml/2006/main" xmlns:pic="http://schemas.openxmlformats.org/drawingml/2006/picture" xmlns:w="http://schemas.openxmlformats.org/wordprocessingml/2006/main" xmlns:w14="http://schemas.microsoft.com/office/word/2010/wordml" mc:Ignorable="w14">
+  <w:p>
+    <w:pPr>
+      <w:jc w:val="left"/>
+    </w:pPr>
+    <w:r>
+      <w:rPr>
+        <w:position w:val="-6"/>
+      </w:rPr>
+      <w:drawing>
+        <wp:inline distT="0" distB="0" distL="0" distR="0">
+          <wp:extent cx="219456" cy="219456"/>
+          <wp:effectExtent l="0" t="0" r="0" b="0"/>
+          <wp:docPr id="9856" name="Emblema9856"/>
+          <wp:cNvGraphicFramePr>
+            <a:graphicFrameLocks noChangeAspect="1"/>
+          </wp:cNvGraphicFramePr>
+          <a:graphic>
+            <a:graphicData uri="http://schemas.openxmlformats.org/drawingml/2006/picture">
+              <pic:pic>
+                <pic:nvPicPr>
+                  <pic:cNvPr id="9856" name="Emblema9856"/>
+                  <pic:cNvPicPr/>
+                </pic:nvPicPr>
+                <pic:blipFill>
+                  <a:blip r:embed="rId1"/>
+                  <a:stretch>
+                    <a:fillRect/>
+                  </a:stretch>
+                </pic:blipFill>
+                <pic:spPr>
+                  <a:xfrm>
+                    <a:off x="0" y="0"/>
+                    <a:ext cx="219456" cy="219456"/>
+                  </a:xfrm>
+                  <a:prstGeom prst="rect">
+                    <a:avLst/>
+                  </a:prstGeom>
+                </pic:spPr>
+              </pic:pic>
+            </a:graphicData>
+          </a:graphic>
+        </wp:inline>
+      </w:drawing>
+    </w:r>
+    <w:r>
+      <w:rPr>
+        <w:rFonts w:ascii="Palatino Linotype" w:hAnsi="Palatino Linotype" w:cs="Palatino Linotype"/>
+        <w:color w:val="6E6A63"/>
+        <w:spacing w:val="60"/>
+        <w:sz w:val="15"/>
+        <w:szCs w:val="15"/>
+        <w:lang w:val="es-AR"/>
+      </w:rPr>
+      <w:t xml:space="preserve">   </w:t>
+    </w:r>
+    <w:r>
+      <w:rPr>
+        <w:rFonts w:ascii="Palatino Linotype" w:hAnsi="Palatino Linotype" w:cs="Palatino Linotype"/>
+        <w:color w:val="6E6A63"/>
+        <w:spacing w:val="60"/>
+        <w:sz w:val="15"/>
+        <w:szCs w:val="15"/>
+        <w:lang w:val="es-AR"/>
+      </w:rPr>
+      <w:t xml:space="preserve">EL PENSAMIENTO ES TU FE</w:t>
     </w:r>
   </w:p>
 </w:hdr>

</xml_diff>

<commit_message>
Grabados de estampa real y sincronía visible en los tres libros
Motor de grabado con marcas de desbaste, tinta despareja, bordes
aplastados y leve giro del taco; regenerados fondos, emblemas, grabados
sueltos y portadas. Cada libro cierra con «La trilogía, capítulo a
capítulo» y un colofón, y las notas de puente llevan el emblema del
capítulo al que remiten.

Co-Authored-By: Claude Opus 5.5 <noreply@anthropic.com>
Claude-Session: https://claude.ai/code/session_014ZXCqSPyLGg43e9ivReU3y
</commit_message>
<xml_diff>
--- a/manuscritos/El Pensamiento es Tu Fe (edición integral).docx
+++ b/manuscritos/El Pensamiento es Tu Fe (edición integral).docx
@@ -2600,6 +2600,7 @@
     </w:p>
     <w:p>
       <w:pPr>
+        <w:spacing w:before="200" w:after="260"/>
         <w:jc w:val="center"/>
         <w:rPr>
           <w:rFonts w:ascii="Palatino Linotype" w:hAnsi="Palatino Linotype" w:cs="Times New Roman"/>
@@ -2609,6 +2610,46 @@
           <w:szCs w:val="18"/>
         </w:rPr>
       </w:pPr>
+      <w:r xmlns:a="http://schemas.openxmlformats.org/drawingml/2006/main" xmlns:pic="http://schemas.openxmlformats.org/drawingml/2006/picture">
+        <w:drawing>
+          <wp:inline distT="0" distB="0" distL="0" distR="0">
+            <wp:extent cx="237744" cy="237744"/>
+            <wp:effectExtent l="0" t="0" r="0" b="0"/>
+            <wp:docPr id="9900" name="Puente9900"/>
+            <wp:cNvGraphicFramePr>
+              <a:graphicFrameLocks noChangeAspect="1"/>
+            </wp:cNvGraphicFramePr>
+            <a:graphic>
+              <a:graphicData uri="http://schemas.openxmlformats.org/drawingml/2006/picture">
+                <pic:pic>
+                  <pic:nvPicPr>
+                    <pic:cNvPr id="9900" name="Puente9900"/>
+                    <pic:cNvPicPr/>
+                  </pic:nvPicPr>
+                  <pic:blipFill>
+                    <a:blip r:embed="rIdJB42"/>
+                    <a:stretch>
+                      <a:fillRect/>
+                    </a:stretch>
+                  </pic:blipFill>
+                  <pic:spPr>
+                    <a:xfrm>
+                      <a:off x="0" y="0"/>
+                      <a:ext cx="237744" cy="237744"/>
+                    </a:xfrm>
+                    <a:prstGeom prst="rect">
+                      <a:avLst/>
+                    </a:prstGeom>
+                  </pic:spPr>
+                </pic:pic>
+              </a:graphicData>
+            </a:graphic>
+          </wp:inline>
+        </w:drawing>
+      </w:r>
+      <w:r>
+        <w:br/>
+      </w:r>
       <w:r>
         <w:rPr>
           <w:rFonts w:ascii="Palatino Linotype" w:hAnsi="Palatino Linotype" w:cs="Times New Roman"/>
@@ -4352,6 +4393,16 @@
       <w:pPr>
         <w:spacing w:before="420" w:after="0"/>
         <w:jc w:val="center"/>
+        <w:sectPr>
+          <w:headerReference w:type="default" r:id="rIdJB38"/>
+          <w:headerReference w:type="even" r:id="rIdJB39"/>
+          <w:footerReference w:type="default" r:id="rIdJB40"/>
+          <w:footerReference w:type="even" r:id="rIdJB40"/>
+          <w:type w:val="continuous"/>
+          <w:pgSz w:w="7920" w:h="12240"/>
+          <w:pgMar w:top="1080" w:right="792" w:bottom="1008" w:left="1080" w:header="560" w:footer="500" w:gutter="0"/>
+          <w:docGrid w:linePitch="360"/>
+        </w:sectPr>
       </w:pPr>
       <w:r>
         <w:rPr>
@@ -4365,9 +4416,1693 @@
         <w:t xml:space="preserve">◆ ◆ ◆</w:t>
       </w:r>
     </w:p>
+    <w:p>
+      <w:pPr>
+        <w:keepNext/>
+        <w:pageBreakBefore/>
+        <w:spacing w:before="1300" w:after="100"/>
+        <w:jc w:val="center"/>
+      </w:pPr>
+      <w:r>
+        <w:rPr>
+          <w:rFonts w:ascii="Palatino Linotype" w:hAnsi="Palatino Linotype" w:cs="Palatino Linotype"/>
+          <w:color w:val="6E6A63"/>
+          <w:spacing w:val="60"/>
+          <w:sz w:val="18"/>
+          <w:szCs w:val="18"/>
+          <w:lang w:val="es-AR"/>
+        </w:rPr>
+        <w:t xml:space="preserve">LA TRILOGÍA, CAPÍTULO A CAPÍTULO</w:t>
+      </w:r>
+    </w:p>
+    <w:p>
+      <w:pPr>
+        <w:keepNext/>
+        <w:spacing w:before="0" w:after="60"/>
+        <w:jc w:val="center"/>
+      </w:pPr>
+      <w:r>
+        <w:rPr>
+          <w:rFonts w:ascii="Palatino Linotype" w:hAnsi="Palatino Linotype" w:cs="Palatino Linotype"/>
+          <w:i/>
+          <w:iCs/>
+          <w:color w:val="6E6A63"/>
+          <w:sz w:val="17"/>
+          <w:szCs w:val="17"/>
+          <w:lang w:val="es-AR"/>
+        </w:rPr>
+        <w:t xml:space="preserve">Cada número de capítulo es la misma imagen vista desde otra faceta.</w:t>
+      </w:r>
+    </w:p>
+    <w:p>
+      <w:pPr>
+        <w:keepNext/>
+        <w:spacing w:before="0" w:after="300"/>
+        <w:jc w:val="center"/>
+      </w:pPr>
+      <w:r>
+        <w:rPr>
+          <w:rFonts w:ascii="Palatino Linotype" w:hAnsi="Palatino Linotype" w:cs="Palatino Linotype"/>
+          <w:color w:val="6E6A63"/>
+          <w:sz w:val="14"/>
+          <w:szCs w:val="14"/>
+          <w:lang w:val="es-AR"/>
+        </w:rPr>
+        <w:t xml:space="preserve">◆</w:t>
+      </w:r>
+    </w:p>
+    <w:tbl xmlns:a="http://schemas.openxmlformats.org/drawingml/2006/main" xmlns:pic="http://schemas.openxmlformats.org/drawingml/2006/picture">
+      <w:tblPr>
+        <w:tblW w:w="6048" w:type="dxa"/>
+        <w:jc w:val="center"/>
+        <w:tblBorders>
+          <w:top w:val="nil"/>
+          <w:left w:val="nil"/>
+          <w:bottom w:val="nil"/>
+          <w:right w:val="nil"/>
+          <w:insideH w:val="nil"/>
+          <w:insideV w:val="nil"/>
+        </w:tblBorders>
+        <w:tblLayout w:type="fixed"/>
+        <w:tblCellMar>
+          <w:left w:w="40" w:type="dxa"/>
+          <w:right w:w="40" w:type="dxa"/>
+        </w:tblCellMar>
+        <w:tblLook w:val="0000" w:firstRow="0" w:lastRow="0" w:firstColumn="0" w:lastColumn="0" w:noHBand="1" w:noVBand="1"/>
+      </w:tblPr>
+      <w:tblGrid>
+        <w:gridCol w:w="504"/>
+        <w:gridCol w:w="1848"/>
+        <w:gridCol w:w="1848"/>
+        <w:gridCol w:w="1848"/>
+      </w:tblGrid>
+      <w:tr>
+        <w:trPr>
+          <w:cantSplit/>
+        </w:trPr>
+        <w:tc>
+          <w:tcPr>
+            <w:tcW w:w="504" w:type="dxa"/>
+            <w:vAlign w:val="top"/>
+          </w:tcPr>
+          <w:p>
+            <w:pPr>
+              <w:spacing w:before="0" w:after="0" w:line="220" w:lineRule="auto"/>
+              <w:jc w:val="center"/>
+            </w:pPr>
+            <w:r>
+              <w:rPr>
+                <w:rFonts w:ascii="Palatino Linotype" w:hAnsi="Palatino Linotype" w:cs="Palatino Linotype"/>
+                <w:color w:val="6E6A63"/>
+                <w:spacing w:val="40"/>
+                <w:sz w:val="14"/>
+                <w:szCs w:val="14"/>
+                <w:lang w:val="es-AR"/>
+              </w:rPr>
+              <w:t xml:space="preserve"/>
+            </w:r>
+          </w:p>
+        </w:tc>
+        <w:tc>
+          <w:tcPr>
+            <w:tcW w:w="1848" w:type="dxa"/>
+            <w:vAlign w:val="top"/>
+          </w:tcPr>
+          <w:p>
+            <w:pPr>
+              <w:spacing w:before="0" w:after="120" w:line="220" w:lineRule="auto"/>
+              <w:jc w:val="center"/>
+            </w:pPr>
+            <w:r>
+              <w:rPr>
+                <w:rFonts w:ascii="Palatino Linotype" w:hAnsi="Palatino Linotype" w:cs="Palatino Linotype"/>
+                <w:color w:val="6E6A63"/>
+                <w:spacing w:val="20"/>
+                <w:sz w:val="13"/>
+                <w:szCs w:val="13"/>
+                <w:lang w:val="es-AR"/>
+              </w:rPr>
+              <w:t xml:space="preserve">RECETA</w:t>
+            </w:r>
+          </w:p>
+        </w:tc>
+        <w:tc>
+          <w:tcPr>
+            <w:tcW w:w="1848" w:type="dxa"/>
+            <w:vAlign w:val="top"/>
+          </w:tcPr>
+          <w:p>
+            <w:pPr>
+              <w:spacing w:before="0" w:after="120" w:line="220" w:lineRule="auto"/>
+              <w:jc w:val="center"/>
+            </w:pPr>
+            <w:r>
+              <w:rPr>
+                <w:rFonts w:ascii="Palatino Linotype" w:hAnsi="Palatino Linotype" w:cs="Palatino Linotype"/>
+                <w:color w:val="2B2B2B"/>
+                <w:spacing w:val="20"/>
+                <w:sz w:val="13"/>
+                <w:szCs w:val="13"/>
+                <w:lang w:val="es-AR"/>
+              </w:rPr>
+              <w:t xml:space="preserve">PENSAMIENTO</w:t>
+            </w:r>
+          </w:p>
+        </w:tc>
+        <w:tc>
+          <w:tcPr>
+            <w:tcW w:w="1848" w:type="dxa"/>
+            <w:vAlign w:val="top"/>
+          </w:tcPr>
+          <w:p>
+            <w:pPr>
+              <w:spacing w:before="0" w:after="120" w:line="220" w:lineRule="auto"/>
+              <w:jc w:val="center"/>
+            </w:pPr>
+            <w:r>
+              <w:rPr>
+                <w:rFonts w:ascii="Palatino Linotype" w:hAnsi="Palatino Linotype" w:cs="Palatino Linotype"/>
+                <w:color w:val="6E6A63"/>
+                <w:spacing w:val="20"/>
+                <w:sz w:val="13"/>
+                <w:szCs w:val="13"/>
+                <w:lang w:val="es-AR"/>
+              </w:rPr>
+              <w:t xml:space="preserve">BIOGRAFÍA</w:t>
+            </w:r>
+          </w:p>
+        </w:tc>
+      </w:tr>
+      <w:tr>
+        <w:trPr>
+          <w:cantSplit/>
+        </w:trPr>
+        <w:tc>
+          <w:tcPr>
+            <w:tcW w:w="504" w:type="dxa"/>
+            <w:vAlign w:val="top"/>
+          </w:tcPr>
+          <w:p>
+            <w:pPr>
+              <w:spacing w:before="0" w:after="0" w:line="220" w:lineRule="auto"/>
+              <w:jc w:val="center"/>
+            </w:pPr>
+            <w:r>
+              <w:rPr>
+                <w:rFonts w:ascii="Palatino Linotype" w:hAnsi="Palatino Linotype" w:cs="Palatino Linotype"/>
+                <w:color w:val="6E6A63"/>
+                <w:spacing w:val="0"/>
+                <w:sz w:val="22"/>
+                <w:szCs w:val="22"/>
+                <w:lang w:val="es-AR"/>
+              </w:rPr>
+              <w:t xml:space="preserve">0</w:t>
+            </w:r>
+          </w:p>
+        </w:tc>
+        <w:tc>
+          <w:tcPr>
+            <w:tcW w:w="1848" w:type="dxa"/>
+            <w:vAlign w:val="top"/>
+          </w:tcPr>
+          <w:p>
+            <w:pPr>
+              <w:spacing w:before="0" w:after="40"/>
+              <w:jc w:val="center"/>
+            </w:pPr>
+            <w:r>
+              <w:drawing>
+                <wp:inline distT="0" distB="0" distL="0" distR="0">
+                  <wp:extent cx="329184" cy="329184"/>
+                  <wp:effectExtent l="0" t="0" r="0" b="0"/>
+                  <wp:docPr id="9901" name="Puente9901"/>
+                  <wp:cNvGraphicFramePr>
+                    <a:graphicFrameLocks noChangeAspect="1"/>
+                  </wp:cNvGraphicFramePr>
+                  <a:graphic>
+                    <a:graphicData uri="http://schemas.openxmlformats.org/drawingml/2006/picture">
+                      <pic:pic>
+                        <pic:nvPicPr>
+                          <pic:cNvPr id="9901" name="Puente9901"/>
+                          <pic:cNvPicPr/>
+                        </pic:nvPicPr>
+                        <pic:blipFill>
+                          <a:blip r:embed="rIdJB43"/>
+                          <a:stretch>
+                            <a:fillRect/>
+                          </a:stretch>
+                        </pic:blipFill>
+                        <pic:spPr>
+                          <a:xfrm>
+                            <a:off x="0" y="0"/>
+                            <a:ext cx="329184" cy="329184"/>
+                          </a:xfrm>
+                          <a:prstGeom prst="rect">
+                            <a:avLst/>
+                          </a:prstGeom>
+                        </pic:spPr>
+                      </pic:pic>
+                    </a:graphicData>
+                  </a:graphic>
+                </wp:inline>
+              </w:drawing>
+            </w:r>
+          </w:p>
+          <w:p>
+            <w:pPr>
+              <w:spacing w:before="0" w:after="180" w:line="220" w:lineRule="auto"/>
+              <w:jc w:val="center"/>
+            </w:pPr>
+            <w:r>
+              <w:rPr>
+                <w:rFonts w:ascii="Palatino Linotype" w:hAnsi="Palatino Linotype" w:cs="Palatino Linotype"/>
+                <w:color w:val="6E6A63"/>
+                <w:spacing w:val="30"/>
+                <w:sz w:val="13"/>
+                <w:szCs w:val="13"/>
+                <w:lang w:val="es-AR"/>
+              </w:rPr>
+              <w:t xml:space="preserve">DOS FORMATOS DE LA MENTE</w:t>
+            </w:r>
+          </w:p>
+        </w:tc>
+        <w:tc>
+          <w:tcPr>
+            <w:tcW w:w="1848" w:type="dxa"/>
+            <w:vAlign w:val="top"/>
+          </w:tcPr>
+          <w:p>
+            <w:pPr>
+              <w:spacing w:before="0" w:after="40"/>
+              <w:jc w:val="center"/>
+            </w:pPr>
+            <w:r>
+              <w:drawing>
+                <wp:inline distT="0" distB="0" distL="0" distR="0">
+                  <wp:extent cx="329184" cy="329184"/>
+                  <wp:effectExtent l="0" t="0" r="0" b="0"/>
+                  <wp:docPr id="9902" name="Puente9902"/>
+                  <wp:cNvGraphicFramePr>
+                    <a:graphicFrameLocks noChangeAspect="1"/>
+                  </wp:cNvGraphicFramePr>
+                  <a:graphic>
+                    <a:graphicData uri="http://schemas.openxmlformats.org/drawingml/2006/picture">
+                      <pic:pic>
+                        <pic:nvPicPr>
+                          <pic:cNvPr id="9902" name="Puente9902"/>
+                          <pic:cNvPicPr/>
+                        </pic:nvPicPr>
+                        <pic:blipFill>
+                          <a:blip r:embed="rIdJB44"/>
+                          <a:stretch>
+                            <a:fillRect/>
+                          </a:stretch>
+                        </pic:blipFill>
+                        <pic:spPr>
+                          <a:xfrm>
+                            <a:off x="0" y="0"/>
+                            <a:ext cx="329184" cy="329184"/>
+                          </a:xfrm>
+                          <a:prstGeom prst="rect">
+                            <a:avLst/>
+                          </a:prstGeom>
+                        </pic:spPr>
+                      </pic:pic>
+                    </a:graphicData>
+                  </a:graphic>
+                </wp:inline>
+              </w:drawing>
+            </w:r>
+          </w:p>
+          <w:p>
+            <w:pPr>
+              <w:spacing w:before="0" w:after="180" w:line="220" w:lineRule="auto"/>
+              <w:jc w:val="center"/>
+            </w:pPr>
+            <w:r>
+              <w:rPr>
+                <w:rFonts w:ascii="Palatino Linotype" w:hAnsi="Palatino Linotype" w:cs="Palatino Linotype"/>
+                <w:color w:val="2B2B2B"/>
+                <w:spacing w:val="30"/>
+                <w:sz w:val="13"/>
+                <w:szCs w:val="13"/>
+                <w:lang w:val="es-AR"/>
+              </w:rPr>
+              <w:t xml:space="preserve">LA PALABRA</w:t>
+            </w:r>
+          </w:p>
+        </w:tc>
+        <w:tc>
+          <w:tcPr>
+            <w:tcW w:w="1848" w:type="dxa"/>
+            <w:vAlign w:val="top"/>
+          </w:tcPr>
+          <w:p>
+            <w:pPr>
+              <w:spacing w:before="0" w:after="40"/>
+              <w:jc w:val="center"/>
+            </w:pPr>
+            <w:r>
+              <w:drawing>
+                <wp:inline distT="0" distB="0" distL="0" distR="0">
+                  <wp:extent cx="329184" cy="329184"/>
+                  <wp:effectExtent l="0" t="0" r="0" b="0"/>
+                  <wp:docPr id="9903" name="Puente9903"/>
+                  <wp:cNvGraphicFramePr>
+                    <a:graphicFrameLocks noChangeAspect="1"/>
+                  </wp:cNvGraphicFramePr>
+                  <a:graphic>
+                    <a:graphicData uri="http://schemas.openxmlformats.org/drawingml/2006/picture">
+                      <pic:pic>
+                        <pic:nvPicPr>
+                          <pic:cNvPr id="9903" name="Puente9903"/>
+                          <pic:cNvPicPr/>
+                        </pic:nvPicPr>
+                        <pic:blipFill>
+                          <a:blip r:embed="rIdJB45"/>
+                          <a:stretch>
+                            <a:fillRect/>
+                          </a:stretch>
+                        </pic:blipFill>
+                        <pic:spPr>
+                          <a:xfrm>
+                            <a:off x="0" y="0"/>
+                            <a:ext cx="329184" cy="329184"/>
+                          </a:xfrm>
+                          <a:prstGeom prst="rect">
+                            <a:avLst/>
+                          </a:prstGeom>
+                        </pic:spPr>
+                      </pic:pic>
+                    </a:graphicData>
+                  </a:graphic>
+                </wp:inline>
+              </w:drawing>
+            </w:r>
+          </w:p>
+          <w:p>
+            <w:pPr>
+              <w:spacing w:before="0" w:after="180" w:line="220" w:lineRule="auto"/>
+              <w:jc w:val="center"/>
+            </w:pPr>
+            <w:r>
+              <w:rPr>
+                <w:rFonts w:ascii="Palatino Linotype" w:hAnsi="Palatino Linotype" w:cs="Palatino Linotype"/>
+                <w:color w:val="6E6A63"/>
+                <w:spacing w:val="30"/>
+                <w:sz w:val="13"/>
+                <w:szCs w:val="13"/>
+                <w:lang w:val="es-AR"/>
+              </w:rPr>
+              <w:t xml:space="preserve">PRIMERA IMAGEN</w:t>
+            </w:r>
+          </w:p>
+        </w:tc>
+      </w:tr>
+      <w:tr>
+        <w:trPr>
+          <w:cantSplit/>
+        </w:trPr>
+        <w:tc>
+          <w:tcPr>
+            <w:tcW w:w="504" w:type="dxa"/>
+            <w:vAlign w:val="top"/>
+          </w:tcPr>
+          <w:p>
+            <w:pPr>
+              <w:spacing w:before="0" w:after="0" w:line="220" w:lineRule="auto"/>
+              <w:jc w:val="center"/>
+            </w:pPr>
+            <w:r>
+              <w:rPr>
+                <w:rFonts w:ascii="Palatino Linotype" w:hAnsi="Palatino Linotype" w:cs="Palatino Linotype"/>
+                <w:color w:val="6E6A63"/>
+                <w:spacing w:val="0"/>
+                <w:sz w:val="22"/>
+                <w:szCs w:val="22"/>
+                <w:lang w:val="es-AR"/>
+              </w:rPr>
+              <w:t xml:space="preserve">1</w:t>
+            </w:r>
+          </w:p>
+        </w:tc>
+        <w:tc>
+          <w:tcPr>
+            <w:tcW w:w="1848" w:type="dxa"/>
+            <w:vAlign w:val="top"/>
+          </w:tcPr>
+          <w:p>
+            <w:pPr>
+              <w:spacing w:before="0" w:after="40"/>
+              <w:jc w:val="center"/>
+            </w:pPr>
+            <w:r>
+              <w:drawing>
+                <wp:inline distT="0" distB="0" distL="0" distR="0">
+                  <wp:extent cx="329184" cy="329184"/>
+                  <wp:effectExtent l="0" t="0" r="0" b="0"/>
+                  <wp:docPr id="9904" name="Puente9904"/>
+                  <wp:cNvGraphicFramePr>
+                    <a:graphicFrameLocks noChangeAspect="1"/>
+                  </wp:cNvGraphicFramePr>
+                  <a:graphic>
+                    <a:graphicData uri="http://schemas.openxmlformats.org/drawingml/2006/picture">
+                      <pic:pic>
+                        <pic:nvPicPr>
+                          <pic:cNvPr id="9904" name="Puente9904"/>
+                          <pic:cNvPicPr/>
+                        </pic:nvPicPr>
+                        <pic:blipFill>
+                          <a:blip r:embed="rIdJB46"/>
+                          <a:stretch>
+                            <a:fillRect/>
+                          </a:stretch>
+                        </pic:blipFill>
+                        <pic:spPr>
+                          <a:xfrm>
+                            <a:off x="0" y="0"/>
+                            <a:ext cx="329184" cy="329184"/>
+                          </a:xfrm>
+                          <a:prstGeom prst="rect">
+                            <a:avLst/>
+                          </a:prstGeom>
+                        </pic:spPr>
+                      </pic:pic>
+                    </a:graphicData>
+                  </a:graphic>
+                </wp:inline>
+              </w:drawing>
+            </w:r>
+          </w:p>
+          <w:p>
+            <w:pPr>
+              <w:spacing w:before="0" w:after="180" w:line="220" w:lineRule="auto"/>
+              <w:jc w:val="center"/>
+            </w:pPr>
+            <w:r>
+              <w:rPr>
+                <w:rFonts w:ascii="Palatino Linotype" w:hAnsi="Palatino Linotype" w:cs="Palatino Linotype"/>
+                <w:color w:val="6E6A63"/>
+                <w:spacing w:val="30"/>
+                <w:sz w:val="13"/>
+                <w:szCs w:val="13"/>
+                <w:lang w:val="es-AR"/>
+              </w:rPr>
+              <w:t xml:space="preserve">EL SENTIMIENTO CREA LA REALIDAD</w:t>
+            </w:r>
+          </w:p>
+        </w:tc>
+        <w:tc>
+          <w:tcPr>
+            <w:tcW w:w="1848" w:type="dxa"/>
+            <w:vAlign w:val="top"/>
+          </w:tcPr>
+          <w:p>
+            <w:pPr>
+              <w:spacing w:before="0" w:after="40"/>
+              <w:jc w:val="center"/>
+            </w:pPr>
+            <w:r>
+              <w:drawing>
+                <wp:inline distT="0" distB="0" distL="0" distR="0">
+                  <wp:extent cx="329184" cy="329184"/>
+                  <wp:effectExtent l="0" t="0" r="0" b="0"/>
+                  <wp:docPr id="9905" name="Puente9905"/>
+                  <wp:cNvGraphicFramePr>
+                    <a:graphicFrameLocks noChangeAspect="1"/>
+                  </wp:cNvGraphicFramePr>
+                  <a:graphic>
+                    <a:graphicData uri="http://schemas.openxmlformats.org/drawingml/2006/picture">
+                      <pic:pic>
+                        <pic:nvPicPr>
+                          <pic:cNvPr id="9905" name="Puente9905"/>
+                          <pic:cNvPicPr/>
+                        </pic:nvPicPr>
+                        <pic:blipFill>
+                          <a:blip r:embed="rIdJB47"/>
+                          <a:stretch>
+                            <a:fillRect/>
+                          </a:stretch>
+                        </pic:blipFill>
+                        <pic:spPr>
+                          <a:xfrm>
+                            <a:off x="0" y="0"/>
+                            <a:ext cx="329184" cy="329184"/>
+                          </a:xfrm>
+                          <a:prstGeom prst="rect">
+                            <a:avLst/>
+                          </a:prstGeom>
+                        </pic:spPr>
+                      </pic:pic>
+                    </a:graphicData>
+                  </a:graphic>
+                </wp:inline>
+              </w:drawing>
+            </w:r>
+          </w:p>
+          <w:p>
+            <w:pPr>
+              <w:spacing w:before="0" w:after="180" w:line="220" w:lineRule="auto"/>
+              <w:jc w:val="center"/>
+            </w:pPr>
+            <w:r>
+              <w:rPr>
+                <w:rFonts w:ascii="Palatino Linotype" w:hAnsi="Palatino Linotype" w:cs="Palatino Linotype"/>
+                <w:color w:val="2B2B2B"/>
+                <w:spacing w:val="30"/>
+                <w:sz w:val="13"/>
+                <w:szCs w:val="13"/>
+                <w:lang w:val="es-AR"/>
+              </w:rPr>
+              <w:t xml:space="preserve">LIBERTAD INTERNA</w:t>
+            </w:r>
+          </w:p>
+        </w:tc>
+        <w:tc>
+          <w:tcPr>
+            <w:tcW w:w="1848" w:type="dxa"/>
+            <w:vAlign w:val="top"/>
+          </w:tcPr>
+          <w:p>
+            <w:pPr>
+              <w:spacing w:before="0" w:after="40"/>
+              <w:jc w:val="center"/>
+            </w:pPr>
+            <w:r>
+              <w:drawing>
+                <wp:inline distT="0" distB="0" distL="0" distR="0">
+                  <wp:extent cx="329184" cy="329184"/>
+                  <wp:effectExtent l="0" t="0" r="0" b="0"/>
+                  <wp:docPr id="9906" name="Puente9906"/>
+                  <wp:cNvGraphicFramePr>
+                    <a:graphicFrameLocks noChangeAspect="1"/>
+                  </wp:cNvGraphicFramePr>
+                  <a:graphic>
+                    <a:graphicData uri="http://schemas.openxmlformats.org/drawingml/2006/picture">
+                      <pic:pic>
+                        <pic:nvPicPr>
+                          <pic:cNvPr id="9906" name="Puente9906"/>
+                          <pic:cNvPicPr/>
+                        </pic:nvPicPr>
+                        <pic:blipFill>
+                          <a:blip r:embed="rIdJB48"/>
+                          <a:stretch>
+                            <a:fillRect/>
+                          </a:stretch>
+                        </pic:blipFill>
+                        <pic:spPr>
+                          <a:xfrm>
+                            <a:off x="0" y="0"/>
+                            <a:ext cx="329184" cy="329184"/>
+                          </a:xfrm>
+                          <a:prstGeom prst="rect">
+                            <a:avLst/>
+                          </a:prstGeom>
+                        </pic:spPr>
+                      </pic:pic>
+                    </a:graphicData>
+                  </a:graphic>
+                </wp:inline>
+              </w:drawing>
+            </w:r>
+          </w:p>
+          <w:p>
+            <w:pPr>
+              <w:spacing w:before="0" w:after="180" w:line="220" w:lineRule="auto"/>
+              <w:jc w:val="center"/>
+            </w:pPr>
+            <w:r>
+              <w:rPr>
+                <w:rFonts w:ascii="Palatino Linotype" w:hAnsi="Palatino Linotype" w:cs="Palatino Linotype"/>
+                <w:color w:val="6E6A63"/>
+                <w:spacing w:val="30"/>
+                <w:sz w:val="13"/>
+                <w:szCs w:val="13"/>
+                <w:lang w:val="es-AR"/>
+              </w:rPr>
+              <w:t xml:space="preserve">EL RECONOCIMIENTO</w:t>
+            </w:r>
+          </w:p>
+        </w:tc>
+      </w:tr>
+      <w:tr>
+        <w:trPr>
+          <w:cantSplit/>
+        </w:trPr>
+        <w:tc>
+          <w:tcPr>
+            <w:tcW w:w="504" w:type="dxa"/>
+            <w:vAlign w:val="top"/>
+          </w:tcPr>
+          <w:p>
+            <w:pPr>
+              <w:spacing w:before="0" w:after="0" w:line="220" w:lineRule="auto"/>
+              <w:jc w:val="center"/>
+            </w:pPr>
+            <w:r>
+              <w:rPr>
+                <w:rFonts w:ascii="Palatino Linotype" w:hAnsi="Palatino Linotype" w:cs="Palatino Linotype"/>
+                <w:color w:val="6E6A63"/>
+                <w:spacing w:val="0"/>
+                <w:sz w:val="22"/>
+                <w:szCs w:val="22"/>
+                <w:lang w:val="es-AR"/>
+              </w:rPr>
+              <w:t xml:space="preserve">2</w:t>
+            </w:r>
+          </w:p>
+        </w:tc>
+        <w:tc>
+          <w:tcPr>
+            <w:tcW w:w="1848" w:type="dxa"/>
+            <w:vAlign w:val="top"/>
+          </w:tcPr>
+          <w:p>
+            <w:pPr>
+              <w:spacing w:before="0" w:after="40"/>
+              <w:jc w:val="center"/>
+            </w:pPr>
+            <w:r>
+              <w:drawing>
+                <wp:inline distT="0" distB="0" distL="0" distR="0">
+                  <wp:extent cx="329184" cy="329184"/>
+                  <wp:effectExtent l="0" t="0" r="0" b="0"/>
+                  <wp:docPr id="9907" name="Puente9907"/>
+                  <wp:cNvGraphicFramePr>
+                    <a:graphicFrameLocks noChangeAspect="1"/>
+                  </wp:cNvGraphicFramePr>
+                  <a:graphic>
+                    <a:graphicData uri="http://schemas.openxmlformats.org/drawingml/2006/picture">
+                      <pic:pic>
+                        <pic:nvPicPr>
+                          <pic:cNvPr id="9907" name="Puente9907"/>
+                          <pic:cNvPicPr/>
+                        </pic:nvPicPr>
+                        <pic:blipFill>
+                          <a:blip r:embed="rIdJB42"/>
+                          <a:stretch>
+                            <a:fillRect/>
+                          </a:stretch>
+                        </pic:blipFill>
+                        <pic:spPr>
+                          <a:xfrm>
+                            <a:off x="0" y="0"/>
+                            <a:ext cx="329184" cy="329184"/>
+                          </a:xfrm>
+                          <a:prstGeom prst="rect">
+                            <a:avLst/>
+                          </a:prstGeom>
+                        </pic:spPr>
+                      </pic:pic>
+                    </a:graphicData>
+                  </a:graphic>
+                </wp:inline>
+              </w:drawing>
+            </w:r>
+          </w:p>
+          <w:p>
+            <w:pPr>
+              <w:spacing w:before="0" w:after="180" w:line="220" w:lineRule="auto"/>
+              <w:jc w:val="center"/>
+            </w:pPr>
+            <w:r>
+              <w:rPr>
+                <w:rFonts w:ascii="Palatino Linotype" w:hAnsi="Palatino Linotype" w:cs="Palatino Linotype"/>
+                <w:color w:val="6E6A63"/>
+                <w:spacing w:val="30"/>
+                <w:sz w:val="13"/>
+                <w:szCs w:val="13"/>
+                <w:lang w:val="es-AR"/>
+              </w:rPr>
+              <w:t xml:space="preserve">CONOCEDORES DEL BIEN Y EL MAL</w:t>
+            </w:r>
+          </w:p>
+        </w:tc>
+        <w:tc>
+          <w:tcPr>
+            <w:tcW w:w="1848" w:type="dxa"/>
+            <w:vAlign w:val="top"/>
+          </w:tcPr>
+          <w:p>
+            <w:pPr>
+              <w:spacing w:before="0" w:after="40"/>
+              <w:jc w:val="center"/>
+            </w:pPr>
+            <w:r>
+              <w:drawing>
+                <wp:inline distT="0" distB="0" distL="0" distR="0">
+                  <wp:extent cx="329184" cy="329184"/>
+                  <wp:effectExtent l="0" t="0" r="0" b="0"/>
+                  <wp:docPr id="9908" name="Puente9908"/>
+                  <wp:cNvGraphicFramePr>
+                    <a:graphicFrameLocks noChangeAspect="1"/>
+                  </wp:cNvGraphicFramePr>
+                  <a:graphic>
+                    <a:graphicData uri="http://schemas.openxmlformats.org/drawingml/2006/picture">
+                      <pic:pic>
+                        <pic:nvPicPr>
+                          <pic:cNvPr id="9908" name="Puente9908"/>
+                          <pic:cNvPicPr/>
+                        </pic:nvPicPr>
+                        <pic:blipFill>
+                          <a:blip r:embed="rIdJB49"/>
+                          <a:stretch>
+                            <a:fillRect/>
+                          </a:stretch>
+                        </pic:blipFill>
+                        <pic:spPr>
+                          <a:xfrm>
+                            <a:off x="0" y="0"/>
+                            <a:ext cx="329184" cy="329184"/>
+                          </a:xfrm>
+                          <a:prstGeom prst="rect">
+                            <a:avLst/>
+                          </a:prstGeom>
+                        </pic:spPr>
+                      </pic:pic>
+                    </a:graphicData>
+                  </a:graphic>
+                </wp:inline>
+              </w:drawing>
+            </w:r>
+          </w:p>
+          <w:p>
+            <w:pPr>
+              <w:spacing w:before="0" w:after="180" w:line="220" w:lineRule="auto"/>
+              <w:jc w:val="center"/>
+            </w:pPr>
+            <w:r>
+              <w:rPr>
+                <w:rFonts w:ascii="Palatino Linotype" w:hAnsi="Palatino Linotype" w:cs="Palatino Linotype"/>
+                <w:color w:val="2B2B2B"/>
+                <w:spacing w:val="30"/>
+                <w:sz w:val="13"/>
+                <w:szCs w:val="13"/>
+                <w:lang w:val="es-AR"/>
+              </w:rPr>
+              <w:t xml:space="preserve">EL OBSERVADOR ETERNO</w:t>
+            </w:r>
+          </w:p>
+        </w:tc>
+        <w:tc>
+          <w:tcPr>
+            <w:tcW w:w="1848" w:type="dxa"/>
+            <w:vAlign w:val="top"/>
+          </w:tcPr>
+          <w:p>
+            <w:pPr>
+              <w:spacing w:before="0" w:after="40"/>
+              <w:jc w:val="center"/>
+            </w:pPr>
+            <w:r>
+              <w:drawing>
+                <wp:inline distT="0" distB="0" distL="0" distR="0">
+                  <wp:extent cx="329184" cy="329184"/>
+                  <wp:effectExtent l="0" t="0" r="0" b="0"/>
+                  <wp:docPr id="9909" name="Puente9909"/>
+                  <wp:cNvGraphicFramePr>
+                    <a:graphicFrameLocks noChangeAspect="1"/>
+                  </wp:cNvGraphicFramePr>
+                  <a:graphic>
+                    <a:graphicData uri="http://schemas.openxmlformats.org/drawingml/2006/picture">
+                      <pic:pic>
+                        <pic:nvPicPr>
+                          <pic:cNvPr id="9909" name="Puente9909"/>
+                          <pic:cNvPicPr/>
+                        </pic:nvPicPr>
+                        <pic:blipFill>
+                          <a:blip r:embed="rIdJB50"/>
+                          <a:stretch>
+                            <a:fillRect/>
+                          </a:stretch>
+                        </pic:blipFill>
+                        <pic:spPr>
+                          <a:xfrm>
+                            <a:off x="0" y="0"/>
+                            <a:ext cx="329184" cy="329184"/>
+                          </a:xfrm>
+                          <a:prstGeom prst="rect">
+                            <a:avLst/>
+                          </a:prstGeom>
+                        </pic:spPr>
+                      </pic:pic>
+                    </a:graphicData>
+                  </a:graphic>
+                </wp:inline>
+              </w:drawing>
+            </w:r>
+          </w:p>
+          <w:p>
+            <w:pPr>
+              <w:spacing w:before="0" w:after="180" w:line="220" w:lineRule="auto"/>
+              <w:jc w:val="center"/>
+            </w:pPr>
+            <w:r>
+              <w:rPr>
+                <w:rFonts w:ascii="Palatino Linotype" w:hAnsi="Palatino Linotype" w:cs="Palatino Linotype"/>
+                <w:color w:val="6E6A63"/>
+                <w:spacing w:val="30"/>
+                <w:sz w:val="13"/>
+                <w:szCs w:val="13"/>
+                <w:lang w:val="es-AR"/>
+              </w:rPr>
+              <w:t xml:space="preserve">EL DESASTRE</w:t>
+            </w:r>
+          </w:p>
+        </w:tc>
+      </w:tr>
+      <w:tr>
+        <w:trPr>
+          <w:cantSplit/>
+        </w:trPr>
+        <w:tc>
+          <w:tcPr>
+            <w:tcW w:w="504" w:type="dxa"/>
+            <w:vAlign w:val="top"/>
+          </w:tcPr>
+          <w:p>
+            <w:pPr>
+              <w:spacing w:before="0" w:after="0" w:line="220" w:lineRule="auto"/>
+              <w:jc w:val="center"/>
+            </w:pPr>
+            <w:r>
+              <w:rPr>
+                <w:rFonts w:ascii="Palatino Linotype" w:hAnsi="Palatino Linotype" w:cs="Palatino Linotype"/>
+                <w:color w:val="6E6A63"/>
+                <w:spacing w:val="0"/>
+                <w:sz w:val="22"/>
+                <w:szCs w:val="22"/>
+                <w:lang w:val="es-AR"/>
+              </w:rPr>
+              <w:t xml:space="preserve">3</w:t>
+            </w:r>
+          </w:p>
+        </w:tc>
+        <w:tc>
+          <w:tcPr>
+            <w:tcW w:w="1848" w:type="dxa"/>
+            <w:vAlign w:val="top"/>
+          </w:tcPr>
+          <w:p>
+            <w:pPr>
+              <w:spacing w:before="0" w:after="40"/>
+              <w:jc w:val="center"/>
+            </w:pPr>
+            <w:r>
+              <w:drawing>
+                <wp:inline distT="0" distB="0" distL="0" distR="0">
+                  <wp:extent cx="329184" cy="329184"/>
+                  <wp:effectExtent l="0" t="0" r="0" b="0"/>
+                  <wp:docPr id="9910" name="Puente9910"/>
+                  <wp:cNvGraphicFramePr>
+                    <a:graphicFrameLocks noChangeAspect="1"/>
+                  </wp:cNvGraphicFramePr>
+                  <a:graphic>
+                    <a:graphicData uri="http://schemas.openxmlformats.org/drawingml/2006/picture">
+                      <pic:pic>
+                        <pic:nvPicPr>
+                          <pic:cNvPr id="9910" name="Puente9910"/>
+                          <pic:cNvPicPr/>
+                        </pic:nvPicPr>
+                        <pic:blipFill>
+                          <a:blip r:embed="rIdJB51"/>
+                          <a:stretch>
+                            <a:fillRect/>
+                          </a:stretch>
+                        </pic:blipFill>
+                        <pic:spPr>
+                          <a:xfrm>
+                            <a:off x="0" y="0"/>
+                            <a:ext cx="329184" cy="329184"/>
+                          </a:xfrm>
+                          <a:prstGeom prst="rect">
+                            <a:avLst/>
+                          </a:prstGeom>
+                        </pic:spPr>
+                      </pic:pic>
+                    </a:graphicData>
+                  </a:graphic>
+                </wp:inline>
+              </w:drawing>
+            </w:r>
+          </w:p>
+          <w:p>
+            <w:pPr>
+              <w:spacing w:before="0" w:after="180" w:line="220" w:lineRule="auto"/>
+              <w:jc w:val="center"/>
+            </w:pPr>
+            <w:r>
+              <w:rPr>
+                <w:rFonts w:ascii="Palatino Linotype" w:hAnsi="Palatino Linotype" w:cs="Palatino Linotype"/>
+                <w:color w:val="6E6A63"/>
+                <w:spacing w:val="30"/>
+                <w:sz w:val="13"/>
+                <w:szCs w:val="13"/>
+                <w:lang w:val="es-AR"/>
+              </w:rPr>
+              <w:t xml:space="preserve">AHORA MISMO</w:t>
+            </w:r>
+          </w:p>
+        </w:tc>
+        <w:tc>
+          <w:tcPr>
+            <w:tcW w:w="1848" w:type="dxa"/>
+            <w:vAlign w:val="top"/>
+          </w:tcPr>
+          <w:p>
+            <w:pPr>
+              <w:spacing w:before="0" w:after="40"/>
+              <w:jc w:val="center"/>
+            </w:pPr>
+            <w:r>
+              <w:drawing>
+                <wp:inline distT="0" distB="0" distL="0" distR="0">
+                  <wp:extent cx="329184" cy="329184"/>
+                  <wp:effectExtent l="0" t="0" r="0" b="0"/>
+                  <wp:docPr id="9911" name="Puente9911"/>
+                  <wp:cNvGraphicFramePr>
+                    <a:graphicFrameLocks noChangeAspect="1"/>
+                  </wp:cNvGraphicFramePr>
+                  <a:graphic>
+                    <a:graphicData uri="http://schemas.openxmlformats.org/drawingml/2006/picture">
+                      <pic:pic>
+                        <pic:nvPicPr>
+                          <pic:cNvPr id="9911" name="Puente9911"/>
+                          <pic:cNvPicPr/>
+                        </pic:nvPicPr>
+                        <pic:blipFill>
+                          <a:blip r:embed="rIdJB52"/>
+                          <a:stretch>
+                            <a:fillRect/>
+                          </a:stretch>
+                        </pic:blipFill>
+                        <pic:spPr>
+                          <a:xfrm>
+                            <a:off x="0" y="0"/>
+                            <a:ext cx="329184" cy="329184"/>
+                          </a:xfrm>
+                          <a:prstGeom prst="rect">
+                            <a:avLst/>
+                          </a:prstGeom>
+                        </pic:spPr>
+                      </pic:pic>
+                    </a:graphicData>
+                  </a:graphic>
+                </wp:inline>
+              </w:drawing>
+            </w:r>
+          </w:p>
+          <w:p>
+            <w:pPr>
+              <w:spacing w:before="0" w:after="180" w:line="220" w:lineRule="auto"/>
+              <w:jc w:val="center"/>
+            </w:pPr>
+            <w:r>
+              <w:rPr>
+                <w:rFonts w:ascii="Palatino Linotype" w:hAnsi="Palatino Linotype" w:cs="Palatino Linotype"/>
+                <w:color w:val="2B2B2B"/>
+                <w:spacing w:val="30"/>
+                <w:sz w:val="13"/>
+                <w:szCs w:val="13"/>
+                <w:lang w:val="es-AR"/>
+              </w:rPr>
+              <w:t xml:space="preserve">CONVERSACIONES SINCERAS</w:t>
+            </w:r>
+          </w:p>
+        </w:tc>
+        <w:tc>
+          <w:tcPr>
+            <w:tcW w:w="1848" w:type="dxa"/>
+            <w:vAlign w:val="top"/>
+          </w:tcPr>
+          <w:p>
+            <w:pPr>
+              <w:spacing w:before="0" w:after="40"/>
+              <w:jc w:val="center"/>
+            </w:pPr>
+            <w:r>
+              <w:drawing>
+                <wp:inline distT="0" distB="0" distL="0" distR="0">
+                  <wp:extent cx="329184" cy="329184"/>
+                  <wp:effectExtent l="0" t="0" r="0" b="0"/>
+                  <wp:docPr id="9912" name="Puente9912"/>
+                  <wp:cNvGraphicFramePr>
+                    <a:graphicFrameLocks noChangeAspect="1"/>
+                  </wp:cNvGraphicFramePr>
+                  <a:graphic>
+                    <a:graphicData uri="http://schemas.openxmlformats.org/drawingml/2006/picture">
+                      <pic:pic>
+                        <pic:nvPicPr>
+                          <pic:cNvPr id="9912" name="Puente9912"/>
+                          <pic:cNvPicPr/>
+                        </pic:nvPicPr>
+                        <pic:blipFill>
+                          <a:blip r:embed="rIdJB53"/>
+                          <a:stretch>
+                            <a:fillRect/>
+                          </a:stretch>
+                        </pic:blipFill>
+                        <pic:spPr>
+                          <a:xfrm>
+                            <a:off x="0" y="0"/>
+                            <a:ext cx="329184" cy="329184"/>
+                          </a:xfrm>
+                          <a:prstGeom prst="rect">
+                            <a:avLst/>
+                          </a:prstGeom>
+                        </pic:spPr>
+                      </pic:pic>
+                    </a:graphicData>
+                  </a:graphic>
+                </wp:inline>
+              </w:drawing>
+            </w:r>
+          </w:p>
+          <w:p>
+            <w:pPr>
+              <w:spacing w:before="0" w:after="180" w:line="220" w:lineRule="auto"/>
+              <w:jc w:val="center"/>
+            </w:pPr>
+            <w:r>
+              <w:rPr>
+                <w:rFonts w:ascii="Palatino Linotype" w:hAnsi="Palatino Linotype" w:cs="Palatino Linotype"/>
+                <w:color w:val="6E6A63"/>
+                <w:spacing w:val="30"/>
+                <w:sz w:val="13"/>
+                <w:szCs w:val="13"/>
+                <w:lang w:val="es-AR"/>
+              </w:rPr>
+              <w:t xml:space="preserve">PONER A PRUEBA</w:t>
+            </w:r>
+          </w:p>
+        </w:tc>
+      </w:tr>
+      <w:tr>
+        <w:trPr>
+          <w:cantSplit/>
+        </w:trPr>
+        <w:tc>
+          <w:tcPr>
+            <w:tcW w:w="504" w:type="dxa"/>
+            <w:vAlign w:val="top"/>
+          </w:tcPr>
+          <w:p>
+            <w:pPr>
+              <w:spacing w:before="0" w:after="0" w:line="220" w:lineRule="auto"/>
+              <w:jc w:val="center"/>
+            </w:pPr>
+            <w:r>
+              <w:rPr>
+                <w:rFonts w:ascii="Palatino Linotype" w:hAnsi="Palatino Linotype" w:cs="Palatino Linotype"/>
+                <w:color w:val="6E6A63"/>
+                <w:spacing w:val="0"/>
+                <w:sz w:val="22"/>
+                <w:szCs w:val="22"/>
+                <w:lang w:val="es-AR"/>
+              </w:rPr>
+              <w:t xml:space="preserve">4</w:t>
+            </w:r>
+          </w:p>
+        </w:tc>
+        <w:tc>
+          <w:tcPr>
+            <w:tcW w:w="1848" w:type="dxa"/>
+            <w:vAlign w:val="top"/>
+          </w:tcPr>
+          <w:p>
+            <w:pPr>
+              <w:spacing w:before="0" w:after="40"/>
+              <w:jc w:val="center"/>
+            </w:pPr>
+            <w:r>
+              <w:drawing>
+                <wp:inline distT="0" distB="0" distL="0" distR="0">
+                  <wp:extent cx="329184" cy="329184"/>
+                  <wp:effectExtent l="0" t="0" r="0" b="0"/>
+                  <wp:docPr id="9913" name="Puente9913"/>
+                  <wp:cNvGraphicFramePr>
+                    <a:graphicFrameLocks noChangeAspect="1"/>
+                  </wp:cNvGraphicFramePr>
+                  <a:graphic>
+                    <a:graphicData uri="http://schemas.openxmlformats.org/drawingml/2006/picture">
+                      <pic:pic>
+                        <pic:nvPicPr>
+                          <pic:cNvPr id="9913" name="Puente9913"/>
+                          <pic:cNvPicPr/>
+                        </pic:nvPicPr>
+                        <pic:blipFill>
+                          <a:blip r:embed="rIdJB54"/>
+                          <a:stretch>
+                            <a:fillRect/>
+                          </a:stretch>
+                        </pic:blipFill>
+                        <pic:spPr>
+                          <a:xfrm>
+                            <a:off x="0" y="0"/>
+                            <a:ext cx="329184" cy="329184"/>
+                          </a:xfrm>
+                          <a:prstGeom prst="rect">
+                            <a:avLst/>
+                          </a:prstGeom>
+                        </pic:spPr>
+                      </pic:pic>
+                    </a:graphicData>
+                  </a:graphic>
+                </wp:inline>
+              </w:drawing>
+            </w:r>
+          </w:p>
+          <w:p>
+            <w:pPr>
+              <w:spacing w:before="0" w:after="180" w:line="220" w:lineRule="auto"/>
+              <w:jc w:val="center"/>
+            </w:pPr>
+            <w:r>
+              <w:rPr>
+                <w:rFonts w:ascii="Palatino Linotype" w:hAnsi="Palatino Linotype" w:cs="Palatino Linotype"/>
+                <w:color w:val="6E6A63"/>
+                <w:spacing w:val="30"/>
+                <w:sz w:val="13"/>
+                <w:szCs w:val="13"/>
+                <w:lang w:val="es-AR"/>
+              </w:rPr>
+              <w:t xml:space="preserve">LA PESCA</w:t>
+            </w:r>
+          </w:p>
+        </w:tc>
+        <w:tc>
+          <w:tcPr>
+            <w:tcW w:w="1848" w:type="dxa"/>
+            <w:vAlign w:val="top"/>
+          </w:tcPr>
+          <w:p>
+            <w:pPr>
+              <w:spacing w:before="0" w:after="40"/>
+              <w:jc w:val="center"/>
+            </w:pPr>
+            <w:r>
+              <w:drawing>
+                <wp:inline distT="0" distB="0" distL="0" distR="0">
+                  <wp:extent cx="329184" cy="329184"/>
+                  <wp:effectExtent l="0" t="0" r="0" b="0"/>
+                  <wp:docPr id="9914" name="Puente9914"/>
+                  <wp:cNvGraphicFramePr>
+                    <a:graphicFrameLocks noChangeAspect="1"/>
+                  </wp:cNvGraphicFramePr>
+                  <a:graphic>
+                    <a:graphicData uri="http://schemas.openxmlformats.org/drawingml/2006/picture">
+                      <pic:pic>
+                        <pic:nvPicPr>
+                          <pic:cNvPr id="9914" name="Puente9914"/>
+                          <pic:cNvPicPr/>
+                        </pic:nvPicPr>
+                        <pic:blipFill>
+                          <a:blip r:embed="rIdJB55"/>
+                          <a:stretch>
+                            <a:fillRect/>
+                          </a:stretch>
+                        </pic:blipFill>
+                        <pic:spPr>
+                          <a:xfrm>
+                            <a:off x="0" y="0"/>
+                            <a:ext cx="329184" cy="329184"/>
+                          </a:xfrm>
+                          <a:prstGeom prst="rect">
+                            <a:avLst/>
+                          </a:prstGeom>
+                        </pic:spPr>
+                      </pic:pic>
+                    </a:graphicData>
+                  </a:graphic>
+                </wp:inline>
+              </w:drawing>
+            </w:r>
+          </w:p>
+          <w:p>
+            <w:pPr>
+              <w:spacing w:before="0" w:after="180" w:line="220" w:lineRule="auto"/>
+              <w:jc w:val="center"/>
+            </w:pPr>
+            <w:r>
+              <w:rPr>
+                <w:rFonts w:ascii="Palatino Linotype" w:hAnsi="Palatino Linotype" w:cs="Palatino Linotype"/>
+                <w:color w:val="2B2B2B"/>
+                <w:spacing w:val="30"/>
+                <w:sz w:val="13"/>
+                <w:szCs w:val="13"/>
+                <w:lang w:val="es-AR"/>
+              </w:rPr>
+              <w:t xml:space="preserve">LA INTELIGENCIA NATURAL</w:t>
+            </w:r>
+          </w:p>
+        </w:tc>
+        <w:tc>
+          <w:tcPr>
+            <w:tcW w:w="1848" w:type="dxa"/>
+            <w:vAlign w:val="top"/>
+          </w:tcPr>
+          <w:p>
+            <w:pPr>
+              <w:spacing w:before="0" w:after="0" w:line="220" w:lineRule="auto"/>
+              <w:jc w:val="center"/>
+            </w:pPr>
+            <w:r>
+              <w:rPr>
+                <w:rFonts w:ascii="Palatino Linotype" w:hAnsi="Palatino Linotype" w:cs="Palatino Linotype"/>
+                <w:color w:val="6E6A63"/>
+                <w:spacing w:val="0"/>
+                <w:sz w:val="16"/>
+                <w:szCs w:val="16"/>
+                <w:lang w:val="es-AR"/>
+              </w:rPr>
+              <w:t xml:space="preserve">·</w:t>
+            </w:r>
+          </w:p>
+        </w:tc>
+      </w:tr>
+      <w:tr>
+        <w:trPr>
+          <w:cantSplit/>
+        </w:trPr>
+        <w:tc>
+          <w:tcPr>
+            <w:tcW w:w="504" w:type="dxa"/>
+            <w:vAlign w:val="top"/>
+          </w:tcPr>
+          <w:p>
+            <w:pPr>
+              <w:spacing w:before="0" w:after="0" w:line="220" w:lineRule="auto"/>
+              <w:jc w:val="center"/>
+            </w:pPr>
+            <w:r>
+              <w:rPr>
+                <w:rFonts w:ascii="Palatino Linotype" w:hAnsi="Palatino Linotype" w:cs="Palatino Linotype"/>
+                <w:color w:val="6E6A63"/>
+                <w:spacing w:val="0"/>
+                <w:sz w:val="22"/>
+                <w:szCs w:val="22"/>
+                <w:lang w:val="es-AR"/>
+              </w:rPr>
+              <w:t xml:space="preserve">5</w:t>
+            </w:r>
+          </w:p>
+        </w:tc>
+        <w:tc>
+          <w:tcPr>
+            <w:tcW w:w="1848" w:type="dxa"/>
+            <w:vAlign w:val="top"/>
+          </w:tcPr>
+          <w:p>
+            <w:pPr>
+              <w:spacing w:before="0" w:after="40"/>
+              <w:jc w:val="center"/>
+            </w:pPr>
+            <w:r>
+              <w:drawing>
+                <wp:inline distT="0" distB="0" distL="0" distR="0">
+                  <wp:extent cx="329184" cy="329184"/>
+                  <wp:effectExtent l="0" t="0" r="0" b="0"/>
+                  <wp:docPr id="9915" name="Puente9915"/>
+                  <wp:cNvGraphicFramePr>
+                    <a:graphicFrameLocks noChangeAspect="1"/>
+                  </wp:cNvGraphicFramePr>
+                  <a:graphic>
+                    <a:graphicData uri="http://schemas.openxmlformats.org/drawingml/2006/picture">
+                      <pic:pic>
+                        <pic:nvPicPr>
+                          <pic:cNvPr id="9915" name="Puente9915"/>
+                          <pic:cNvPicPr/>
+                        </pic:nvPicPr>
+                        <pic:blipFill>
+                          <a:blip r:embed="rIdJB56"/>
+                          <a:stretch>
+                            <a:fillRect/>
+                          </a:stretch>
+                        </pic:blipFill>
+                        <pic:spPr>
+                          <a:xfrm>
+                            <a:off x="0" y="0"/>
+                            <a:ext cx="329184" cy="329184"/>
+                          </a:xfrm>
+                          <a:prstGeom prst="rect">
+                            <a:avLst/>
+                          </a:prstGeom>
+                        </pic:spPr>
+                      </pic:pic>
+                    </a:graphicData>
+                  </a:graphic>
+                </wp:inline>
+              </w:drawing>
+            </w:r>
+          </w:p>
+          <w:p>
+            <w:pPr>
+              <w:spacing w:before="0" w:after="180" w:line="220" w:lineRule="auto"/>
+              <w:jc w:val="center"/>
+            </w:pPr>
+            <w:r>
+              <w:rPr>
+                <w:rFonts w:ascii="Palatino Linotype" w:hAnsi="Palatino Linotype" w:cs="Palatino Linotype"/>
+                <w:color w:val="6E6A63"/>
+                <w:spacing w:val="30"/>
+                <w:sz w:val="13"/>
+                <w:szCs w:val="13"/>
+                <w:lang w:val="es-AR"/>
+              </w:rPr>
+              <w:t xml:space="preserve">CARGAR EL ESTADO</w:t>
+            </w:r>
+          </w:p>
+        </w:tc>
+        <w:tc>
+          <w:tcPr>
+            <w:tcW w:w="1848" w:type="dxa"/>
+            <w:vAlign w:val="top"/>
+          </w:tcPr>
+          <w:p>
+            <w:pPr>
+              <w:spacing w:before="0" w:after="40"/>
+              <w:jc w:val="center"/>
+            </w:pPr>
+            <w:r>
+              <w:drawing>
+                <wp:inline distT="0" distB="0" distL="0" distR="0">
+                  <wp:extent cx="329184" cy="329184"/>
+                  <wp:effectExtent l="0" t="0" r="0" b="0"/>
+                  <wp:docPr id="9916" name="Puente9916"/>
+                  <wp:cNvGraphicFramePr>
+                    <a:graphicFrameLocks noChangeAspect="1"/>
+                  </wp:cNvGraphicFramePr>
+                  <a:graphic>
+                    <a:graphicData uri="http://schemas.openxmlformats.org/drawingml/2006/picture">
+                      <pic:pic>
+                        <pic:nvPicPr>
+                          <pic:cNvPr id="9916" name="Puente9916"/>
+                          <pic:cNvPicPr/>
+                        </pic:nvPicPr>
+                        <pic:blipFill>
+                          <a:blip r:embed="rIdJB57"/>
+                          <a:stretch>
+                            <a:fillRect/>
+                          </a:stretch>
+                        </pic:blipFill>
+                        <pic:spPr>
+                          <a:xfrm>
+                            <a:off x="0" y="0"/>
+                            <a:ext cx="329184" cy="329184"/>
+                          </a:xfrm>
+                          <a:prstGeom prst="rect">
+                            <a:avLst/>
+                          </a:prstGeom>
+                        </pic:spPr>
+                      </pic:pic>
+                    </a:graphicData>
+                  </a:graphic>
+                </wp:inline>
+              </w:drawing>
+            </w:r>
+          </w:p>
+          <w:p>
+            <w:pPr>
+              <w:spacing w:before="0" w:after="180" w:line="220" w:lineRule="auto"/>
+              <w:jc w:val="center"/>
+            </w:pPr>
+            <w:r>
+              <w:rPr>
+                <w:rFonts w:ascii="Palatino Linotype" w:hAnsi="Palatino Linotype" w:cs="Palatino Linotype"/>
+                <w:color w:val="2B2B2B"/>
+                <w:spacing w:val="30"/>
+                <w:sz w:val="13"/>
+                <w:szCs w:val="13"/>
+                <w:lang w:val="es-AR"/>
+              </w:rPr>
+              <w:t xml:space="preserve">ARQUETIPOS</w:t>
+            </w:r>
+          </w:p>
+        </w:tc>
+        <w:tc>
+          <w:tcPr>
+            <w:tcW w:w="1848" w:type="dxa"/>
+            <w:vAlign w:val="top"/>
+          </w:tcPr>
+          <w:p>
+            <w:pPr>
+              <w:spacing w:before="0" w:after="0" w:line="220" w:lineRule="auto"/>
+              <w:jc w:val="center"/>
+            </w:pPr>
+            <w:r>
+              <w:rPr>
+                <w:rFonts w:ascii="Palatino Linotype" w:hAnsi="Palatino Linotype" w:cs="Palatino Linotype"/>
+                <w:color w:val="6E6A63"/>
+                <w:spacing w:val="0"/>
+                <w:sz w:val="16"/>
+                <w:szCs w:val="16"/>
+                <w:lang w:val="es-AR"/>
+              </w:rPr>
+              <w:t xml:space="preserve">·</w:t>
+            </w:r>
+          </w:p>
+        </w:tc>
+      </w:tr>
+      <w:tr>
+        <w:trPr>
+          <w:cantSplit/>
+        </w:trPr>
+        <w:tc>
+          <w:tcPr>
+            <w:tcW w:w="504" w:type="dxa"/>
+            <w:vAlign w:val="top"/>
+          </w:tcPr>
+          <w:p>
+            <w:pPr>
+              <w:spacing w:before="0" w:after="0" w:line="220" w:lineRule="auto"/>
+              <w:jc w:val="center"/>
+            </w:pPr>
+            <w:r>
+              <w:rPr>
+                <w:rFonts w:ascii="Palatino Linotype" w:hAnsi="Palatino Linotype" w:cs="Palatino Linotype"/>
+                <w:color w:val="6E6A63"/>
+                <w:spacing w:val="0"/>
+                <w:sz w:val="22"/>
+                <w:szCs w:val="22"/>
+                <w:lang w:val="es-AR"/>
+              </w:rPr>
+              <w:t xml:space="preserve">6</w:t>
+            </w:r>
+          </w:p>
+        </w:tc>
+        <w:tc>
+          <w:tcPr>
+            <w:tcW w:w="1848" w:type="dxa"/>
+            <w:vAlign w:val="top"/>
+          </w:tcPr>
+          <w:p>
+            <w:pPr>
+              <w:spacing w:before="0" w:after="0" w:line="220" w:lineRule="auto"/>
+              <w:jc w:val="center"/>
+            </w:pPr>
+            <w:r>
+              <w:rPr>
+                <w:rFonts w:ascii="Palatino Linotype" w:hAnsi="Palatino Linotype" w:cs="Palatino Linotype"/>
+                <w:color w:val="6E6A63"/>
+                <w:spacing w:val="0"/>
+                <w:sz w:val="16"/>
+                <w:szCs w:val="16"/>
+                <w:lang w:val="es-AR"/>
+              </w:rPr>
+              <w:t xml:space="preserve">·</w:t>
+            </w:r>
+          </w:p>
+        </w:tc>
+        <w:tc>
+          <w:tcPr>
+            <w:tcW w:w="1848" w:type="dxa"/>
+            <w:vAlign w:val="top"/>
+          </w:tcPr>
+          <w:p>
+            <w:pPr>
+              <w:spacing w:before="0" w:after="40"/>
+              <w:jc w:val="center"/>
+            </w:pPr>
+            <w:r>
+              <w:drawing>
+                <wp:inline distT="0" distB="0" distL="0" distR="0">
+                  <wp:extent cx="329184" cy="329184"/>
+                  <wp:effectExtent l="0" t="0" r="0" b="0"/>
+                  <wp:docPr id="9917" name="Puente9917"/>
+                  <wp:cNvGraphicFramePr>
+                    <a:graphicFrameLocks noChangeAspect="1"/>
+                  </wp:cNvGraphicFramePr>
+                  <a:graphic>
+                    <a:graphicData uri="http://schemas.openxmlformats.org/drawingml/2006/picture">
+                      <pic:pic>
+                        <pic:nvPicPr>
+                          <pic:cNvPr id="9917" name="Puente9917"/>
+                          <pic:cNvPicPr/>
+                        </pic:nvPicPr>
+                        <pic:blipFill>
+                          <a:blip r:embed="rIdJB58"/>
+                          <a:stretch>
+                            <a:fillRect/>
+                          </a:stretch>
+                        </pic:blipFill>
+                        <pic:spPr>
+                          <a:xfrm>
+                            <a:off x="0" y="0"/>
+                            <a:ext cx="329184" cy="329184"/>
+                          </a:xfrm>
+                          <a:prstGeom prst="rect">
+                            <a:avLst/>
+                          </a:prstGeom>
+                        </pic:spPr>
+                      </pic:pic>
+                    </a:graphicData>
+                  </a:graphic>
+                </wp:inline>
+              </w:drawing>
+            </w:r>
+          </w:p>
+          <w:p>
+            <w:pPr>
+              <w:spacing w:before="0" w:after="180" w:line="220" w:lineRule="auto"/>
+              <w:jc w:val="center"/>
+            </w:pPr>
+            <w:r>
+              <w:rPr>
+                <w:rFonts w:ascii="Palatino Linotype" w:hAnsi="Palatino Linotype" w:cs="Palatino Linotype"/>
+                <w:color w:val="2B2B2B"/>
+                <w:spacing w:val="30"/>
+                <w:sz w:val="13"/>
+                <w:szCs w:val="13"/>
+                <w:lang w:val="es-AR"/>
+              </w:rPr>
+              <w:t xml:space="preserve">ATRAVESAR EL TIEMPO</w:t>
+            </w:r>
+          </w:p>
+        </w:tc>
+        <w:tc>
+          <w:tcPr>
+            <w:tcW w:w="1848" w:type="dxa"/>
+            <w:vAlign w:val="top"/>
+          </w:tcPr>
+          <w:p>
+            <w:pPr>
+              <w:spacing w:before="0" w:after="0" w:line="220" w:lineRule="auto"/>
+              <w:jc w:val="center"/>
+            </w:pPr>
+            <w:r>
+              <w:rPr>
+                <w:rFonts w:ascii="Palatino Linotype" w:hAnsi="Palatino Linotype" w:cs="Palatino Linotype"/>
+                <w:color w:val="6E6A63"/>
+                <w:spacing w:val="0"/>
+                <w:sz w:val="16"/>
+                <w:szCs w:val="16"/>
+                <w:lang w:val="es-AR"/>
+              </w:rPr>
+              <w:t xml:space="preserve">·</w:t>
+            </w:r>
+          </w:p>
+        </w:tc>
+      </w:tr>
+    </w:tbl>
+    <w:p>
+      <w:pPr>
+        <w:spacing w:before="0" w:after="0"/>
+        <w:jc w:val="center"/>
+      </w:pPr>
+      <w:r>
+        <w:rPr>
+          <w:rFonts w:ascii="Palatino Linotype" w:hAnsi="Palatino Linotype" w:cs="Palatino Linotype"/>
+          <w:sz w:val="8"/>
+          <w:szCs w:val="8"/>
+          <w:lang w:val="es-AR"/>
+        </w:rPr>
+        <w:t xml:space="preserve"/>
+      </w:r>
+    </w:p>
+    <w:p>
+      <w:pPr>
+        <w:keepNext/>
+        <w:pageBreakBefore/>
+        <w:spacing w:before="3000" w:after="500"/>
+        <w:ind w:left="700" w:right="700"/>
+        <w:jc w:val="center"/>
+      </w:pPr>
+      <w:r>
+        <w:rPr>
+          <w:rFonts w:ascii="Palatino Linotype" w:hAnsi="Palatino Linotype" w:cs="Palatino Linotype"/>
+          <w:color w:val="6E6A63"/>
+          <w:spacing w:val="20"/>
+          <w:sz w:val="14"/>
+          <w:szCs w:val="14"/>
+          <w:lang w:val="es-AR"/>
+        </w:rPr>
+        <w:t xml:space="preserve">◆</w:t>
+      </w:r>
+    </w:p>
+    <w:p>
+      <w:pPr>
+        <w:keepNext/>
+        <w:spacing w:before="0" w:after="160"/>
+        <w:ind w:left="700" w:right="700"/>
+        <w:jc w:val="center"/>
+      </w:pPr>
+      <w:r>
+        <w:rPr>
+          <w:rFonts w:ascii="Palatino Linotype" w:hAnsi="Palatino Linotype" w:cs="Palatino Linotype"/>
+          <w:i/>
+          <w:iCs/>
+          <w:color w:val="6E6A63"/>
+          <w:spacing w:val="0"/>
+          <w:sz w:val="17"/>
+          <w:szCs w:val="17"/>
+          <w:lang w:val="es-AR"/>
+        </w:rPr>
+        <w:t xml:space="preserve">Este libro se terminó de componer en septiembre de 2026, en tipografía Palatino, para ELVERBO EDITORIAL.</w:t>
+      </w:r>
+    </w:p>
+    <w:p>
+      <w:pPr>
+        <w:keepNext/>
+        <w:spacing w:before="0" w:after="160"/>
+        <w:ind w:left="700" w:right="700"/>
+        <w:jc w:val="center"/>
+      </w:pPr>
+      <w:r>
+        <w:rPr>
+          <w:rFonts w:ascii="Palatino Linotype" w:hAnsi="Palatino Linotype" w:cs="Palatino Linotype"/>
+          <w:i/>
+          <w:iCs/>
+          <w:color w:val="6E6A63"/>
+          <w:spacing w:val="0"/>
+          <w:sz w:val="17"/>
+          <w:szCs w:val="17"/>
+          <w:lang w:val="es-AR"/>
+        </w:rPr>
+        <w:t xml:space="preserve">Los grabados que abren cada capítulo comparten orla y motivo en los tres libros de la trilogía: el mismo número de capítulo, la misma imagen, vista desde otra faceta de Julián Bermúdez.</w:t>
+      </w:r>
+    </w:p>
+    <w:p>
+      <w:pPr>
+        <w:keepNext/>
+        <w:spacing w:before="0" w:after="0"/>
+        <w:ind w:left="700" w:right="700"/>
+        <w:jc w:val="center"/>
+      </w:pPr>
+      <w:r>
+        <w:rPr>
+          <w:rFonts w:ascii="Palatino Linotype" w:hAnsi="Palatino Linotype" w:cs="Palatino Linotype"/>
+          <w:color w:val="6E6A63"/>
+          <w:spacing w:val="0"/>
+          <w:sz w:val="15"/>
+          <w:szCs w:val="15"/>
+          <w:lang w:val="es-AR"/>
+        </w:rPr>
+        <w:t xml:space="preserve">Buenos Aires, Argentina</w:t>
+      </w:r>
+    </w:p>
     <w:sectPr>
-      <w:headerReference w:type="default" r:id="rIdJB38"/>
-      <w:headerReference w:type="even" r:id="rIdJB39"/>
+      <w:headerReference w:type="default" r:id="rIdJB15"/>
+      <w:headerReference w:type="even" r:id="rIdJB15"/>
       <w:footerReference w:type="default" r:id="rIdJB40"/>
       <w:footerReference w:type="even" r:id="rIdJB40"/>
       <w:pgSz w:w="7920" w:h="12240"/>

</xml_diff>